<commit_message>
latest upadate on 11-03-2026
</commit_message>
<xml_diff>
--- a/LMBTech Payment System - API Documentation.docx
+++ b/LMBTech Payment System - API Documentation.docx
@@ -6465,7 +6465,7 @@
           <w:bCs/>
           <w:color w:val="000000" w:themeColor="text1"/>
         </w:rPr>
-        <w:t>Mobile Money Callback (JSON):</w:t>
+        <w:t>Mobile Callback (JSON):</w:t>
       </w:r>
     </w:p>
     <w:p>
@@ -6710,204 +6710,196 @@
       <w:pPr>
         <w:rPr>
           <w:rFonts w:ascii="Bookman Old Style" w:hAnsi="Bookman Old Style"/>
-          <w:color w:val="000000" w:themeColor="text1"/>
-        </w:rPr>
-      </w:pPr>
-      <w:r>
-        <w:rPr>
-          <w:rFonts w:ascii="Bookman Old Style" w:hAnsi="Bookman Old Style"/>
-          <w:b/>
-          <w:bCs/>
-          <w:color w:val="000000" w:themeColor="text1"/>
-        </w:rPr>
-        <w:t>Card Payment Callback (Form Data)</w:t>
-      </w:r>
-    </w:p>
-    <w:p>
-      <w:pPr>
-        <w:rPr>
-          <w:rFonts w:ascii="Bookman Old Style" w:hAnsi="Bookman Old Style"/>
-          <w:color w:val="000000" w:themeColor="text1"/>
-        </w:rPr>
-      </w:pPr>
-      <w:r>
-        <w:rPr>
-          <w:rFonts w:ascii="Bookman Old Style" w:hAnsi="Bookman Old Style"/>
-          <w:color w:val="000000" w:themeColor="text1"/>
-        </w:rPr>
-        <w:t xml:space="preserve">Field: </w:t>
+          <w:b/>
+          <w:bCs/>
+          <w:color w:val="000000" w:themeColor="text1"/>
+          <w:lang w:val="en-RW"/>
+        </w:rPr>
+      </w:pPr>
+      <w:r>
+        <w:rPr>
+          <w:rFonts w:ascii="Bookman Old Style" w:hAnsi="Bookman Old Style"/>
+          <w:b/>
+          <w:bCs/>
+          <w:color w:val="000000" w:themeColor="text1"/>
+          <w:lang w:val="en-RW"/>
+        </w:rPr>
+        <w:t>Callback Handler Logic (Pseudo-code)</w:t>
+      </w:r>
+    </w:p>
+    <w:p>
+      <w:pPr>
+        <w:rPr>
+          <w:rFonts w:ascii="Bookman Old Style" w:hAnsi="Bookman Old Style"/>
+          <w:color w:val="000000" w:themeColor="text1"/>
+          <w:lang w:val="en-RW"/>
+        </w:rPr>
+      </w:pPr>
+      <w:r>
+        <w:rPr>
+          <w:rFonts w:ascii="Bookman Old Style" w:hAnsi="Bookman Old Style"/>
+          <w:color w:val="000000" w:themeColor="text1"/>
+          <w:lang w:val="en-RW"/>
+        </w:rPr>
+        <w:t xml:space="preserve">FUNCTION </w:t>
       </w:r>
       <w:proofErr w:type="spellStart"/>
       <w:r>
         <w:rPr>
           <w:rFonts w:ascii="Bookman Old Style" w:hAnsi="Bookman Old Style"/>
           <w:color w:val="000000" w:themeColor="text1"/>
-        </w:rPr>
-        <w:t>pesapal_merchant_reference</w:t>
+          <w:lang w:val="en-RW"/>
+        </w:rPr>
+        <w:t>handle_callback</w:t>
       </w:r>
       <w:proofErr w:type="spellEnd"/>
       <w:r>
         <w:rPr>
           <w:rFonts w:ascii="Bookman Old Style" w:hAnsi="Bookman Old Style"/>
           <w:color w:val="000000" w:themeColor="text1"/>
-        </w:rPr>
-        <w:t xml:space="preserve"> = ORDER-20260215-1234</w:t>
-      </w:r>
-    </w:p>
-    <w:p>
-      <w:pPr>
-        <w:rPr>
-          <w:rFonts w:ascii="Bookman Old Style" w:hAnsi="Bookman Old Style"/>
-          <w:color w:val="000000" w:themeColor="text1"/>
-        </w:rPr>
-      </w:pPr>
-      <w:r>
-        <w:rPr>
-          <w:rFonts w:ascii="Bookman Old Style" w:hAnsi="Bookman Old Style"/>
-          <w:color w:val="000000" w:themeColor="text1"/>
-        </w:rPr>
-        <w:t xml:space="preserve">Field: </w:t>
+          <w:lang w:val="en-RW"/>
+        </w:rPr>
+        <w:t>(request):</w:t>
+      </w:r>
+      <w:r>
+        <w:rPr>
+          <w:rFonts w:ascii="Bookman Old Style" w:hAnsi="Bookman Old Style"/>
+          <w:color w:val="000000" w:themeColor="text1"/>
+          <w:lang w:val="en-RW"/>
+        </w:rPr>
+        <w:br/>
+      </w:r>
+      <w:r>
+        <w:rPr>
+          <w:rFonts w:ascii="Bookman Old Style" w:hAnsi="Bookman Old Style"/>
+          <w:color w:val="000000" w:themeColor="text1"/>
+          <w:lang w:val="en-RW"/>
+        </w:rPr>
+        <w:br/>
+        <w:t xml:space="preserve">    // Step 1: Read callback data from request body</w:t>
+      </w:r>
+      <w:r>
+        <w:rPr>
+          <w:rFonts w:ascii="Bookman Old Style" w:hAnsi="Bookman Old Style"/>
+          <w:color w:val="000000" w:themeColor="text1"/>
+          <w:lang w:val="en-RW"/>
+        </w:rPr>
+        <w:br/>
+        <w:t xml:space="preserve">    </w:t>
       </w:r>
       <w:proofErr w:type="spellStart"/>
       <w:r>
         <w:rPr>
           <w:rFonts w:ascii="Bookman Old Style" w:hAnsi="Bookman Old Style"/>
           <w:color w:val="000000" w:themeColor="text1"/>
-        </w:rPr>
-        <w:t>pesapal_transaction_tracking_id</w:t>
+          <w:lang w:val="en-RW"/>
+        </w:rPr>
+        <w:t>callbackData</w:t>
       </w:r>
       <w:proofErr w:type="spellEnd"/>
       <w:r>
         <w:rPr>
           <w:rFonts w:ascii="Bookman Old Style" w:hAnsi="Bookman Old Style"/>
           <w:color w:val="000000" w:themeColor="text1"/>
-        </w:rPr>
-        <w:t xml:space="preserve"> = TXN-987654321</w:t>
-      </w:r>
-    </w:p>
-    <w:p>
-      <w:pPr>
-        <w:rPr>
-          <w:rFonts w:ascii="Bookman Old Style" w:hAnsi="Bookman Old Style"/>
-          <w:color w:val="000000" w:themeColor="text1"/>
-        </w:rPr>
-      </w:pPr>
-      <w:r>
-        <w:rPr>
-          <w:rFonts w:ascii="Bookman Old Style" w:hAnsi="Bookman Old Style"/>
-          <w:color w:val="000000" w:themeColor="text1"/>
-        </w:rPr>
-        <w:t xml:space="preserve">Field: </w:t>
+          <w:lang w:val="en-RW"/>
+        </w:rPr>
+        <w:t xml:space="preserve"> = </w:t>
       </w:r>
       <w:proofErr w:type="spellStart"/>
       <w:r>
         <w:rPr>
           <w:rFonts w:ascii="Bookman Old Style" w:hAnsi="Bookman Old Style"/>
           <w:color w:val="000000" w:themeColor="text1"/>
-        </w:rPr>
-        <w:t>pesapal_response_data</w:t>
+          <w:lang w:val="en-RW"/>
+        </w:rPr>
+        <w:t>parse_json</w:t>
       </w:r>
       <w:proofErr w:type="spellEnd"/>
       <w:r>
         <w:rPr>
           <w:rFonts w:ascii="Bookman Old Style" w:hAnsi="Bookman Old Style"/>
           <w:color w:val="000000" w:themeColor="text1"/>
-        </w:rPr>
-        <w:t xml:space="preserve"> = COMPLETED</w:t>
-      </w:r>
-    </w:p>
-    <w:p>
-      <w:pPr>
-        <w:rPr>
-          <w:rFonts w:ascii="Bookman Old Style" w:hAnsi="Bookman Old Style"/>
-          <w:b/>
-          <w:bCs/>
-          <w:color w:val="000000" w:themeColor="text1"/>
-        </w:rPr>
-      </w:pPr>
-      <w:r>
-        <w:rPr>
-          <w:rFonts w:ascii="Bookman Old Style" w:hAnsi="Bookman Old Style"/>
-          <w:b/>
-          <w:bCs/>
-          <w:color w:val="000000" w:themeColor="text1"/>
-        </w:rPr>
-        <w:t>Callback Handler Logic (Pseudo-code)</w:t>
-      </w:r>
-    </w:p>
-    <w:p>
-      <w:pPr>
-        <w:rPr>
-          <w:rFonts w:ascii="Bookman Old Style" w:hAnsi="Bookman Old Style"/>
-          <w:color w:val="000000" w:themeColor="text1"/>
-        </w:rPr>
-      </w:pPr>
-      <w:r>
-        <w:rPr>
-          <w:rFonts w:ascii="Bookman Old Style" w:hAnsi="Bookman Old Style"/>
-          <w:color w:val="000000" w:themeColor="text1"/>
-        </w:rPr>
-        <w:t xml:space="preserve">FUNCTION </w:t>
+          <w:lang w:val="en-RW"/>
+        </w:rPr>
+        <w:t>(</w:t>
       </w:r>
       <w:proofErr w:type="spellStart"/>
       <w:r>
         <w:rPr>
           <w:rFonts w:ascii="Bookman Old Style" w:hAnsi="Bookman Old Style"/>
           <w:color w:val="000000" w:themeColor="text1"/>
-        </w:rPr>
-        <w:t>handle_callback</w:t>
+          <w:lang w:val="en-RW"/>
+        </w:rPr>
+        <w:t>request.body</w:t>
       </w:r>
       <w:proofErr w:type="spellEnd"/>
       <w:r>
         <w:rPr>
           <w:rFonts w:ascii="Bookman Old Style" w:hAnsi="Bookman Old Style"/>
           <w:color w:val="000000" w:themeColor="text1"/>
-        </w:rPr>
-        <w:t>(request):</w:t>
-      </w:r>
-    </w:p>
-    <w:p>
-      <w:pPr>
-        <w:rPr>
-          <w:rFonts w:ascii="Bookman Old Style" w:hAnsi="Bookman Old Style"/>
-          <w:color w:val="000000" w:themeColor="text1"/>
-        </w:rPr>
-      </w:pPr>
-      <w:r>
-        <w:rPr>
-          <w:rFonts w:ascii="Bookman Old Style" w:hAnsi="Bookman Old Style"/>
-          <w:color w:val="000000" w:themeColor="text1"/>
-        </w:rPr>
-        <w:t xml:space="preserve">    // Step 1: Determine callback type and extract data</w:t>
-      </w:r>
-    </w:p>
-    <w:p>
-      <w:pPr>
-        <w:rPr>
-          <w:rFonts w:ascii="Bookman Old Style" w:hAnsi="Bookman Old Style"/>
-          <w:color w:val="000000" w:themeColor="text1"/>
-        </w:rPr>
-      </w:pPr>
-      <w:r>
-        <w:rPr>
-          <w:rFonts w:ascii="Bookman Old Style" w:hAnsi="Bookman Old Style"/>
-          <w:color w:val="000000" w:themeColor="text1"/>
-        </w:rPr>
-        <w:t xml:space="preserve">    IF request has form data:</w:t>
-      </w:r>
-    </w:p>
-    <w:p>
-      <w:pPr>
-        <w:rPr>
-          <w:rFonts w:ascii="Bookman Old Style" w:hAnsi="Bookman Old Style"/>
-          <w:color w:val="000000" w:themeColor="text1"/>
-        </w:rPr>
-      </w:pPr>
-      <w:r>
-        <w:rPr>
-          <w:rFonts w:ascii="Bookman Old Style" w:hAnsi="Bookman Old Style"/>
-          <w:color w:val="000000" w:themeColor="text1"/>
-        </w:rPr>
+          <w:lang w:val="en-RW"/>
+        </w:rPr>
+        <w:t>)</w:t>
+      </w:r>
+      <w:r>
+        <w:rPr>
+          <w:rFonts w:ascii="Bookman Old Style" w:hAnsi="Bookman Old Style"/>
+          <w:color w:val="000000" w:themeColor="text1"/>
+          <w:lang w:val="en-RW"/>
+        </w:rPr>
+        <w:br/>
+      </w:r>
+      <w:r>
+        <w:rPr>
+          <w:rFonts w:ascii="Bookman Old Style" w:hAnsi="Bookman Old Style"/>
+          <w:color w:val="000000" w:themeColor="text1"/>
+          <w:lang w:val="en-RW"/>
+        </w:rPr>
+        <w:br/>
+      </w:r>
+      <w:r>
+        <w:rPr>
+          <w:rFonts w:ascii="Bookman Old Style" w:hAnsi="Bookman Old Style"/>
+          <w:color w:val="000000" w:themeColor="text1"/>
+          <w:lang w:val="en-RW"/>
+        </w:rPr>
+        <w:br/>
+        <w:t xml:space="preserve">    // Step 2: Validate required fields</w:t>
+      </w:r>
+      <w:r>
+        <w:rPr>
+          <w:rFonts w:ascii="Bookman Old Style" w:hAnsi="Bookman Old Style"/>
+          <w:color w:val="000000" w:themeColor="text1"/>
+          <w:lang w:val="en-RW"/>
+        </w:rPr>
+        <w:br/>
+        <w:t xml:space="preserve">    IF </w:t>
+      </w:r>
+      <w:proofErr w:type="spellStart"/>
+      <w:r>
+        <w:rPr>
+          <w:rFonts w:ascii="Bookman Old Style" w:hAnsi="Bookman Old Style"/>
+          <w:color w:val="000000" w:themeColor="text1"/>
+          <w:lang w:val="en-RW"/>
+        </w:rPr>
+        <w:t>callbackData</w:t>
+      </w:r>
+      <w:proofErr w:type="spellEnd"/>
+      <w:r>
+        <w:rPr>
+          <w:rFonts w:ascii="Bookman Old Style" w:hAnsi="Bookman Old Style"/>
+          <w:color w:val="000000" w:themeColor="text1"/>
+          <w:lang w:val="en-RW"/>
+        </w:rPr>
+        <w:t xml:space="preserve"> contains</w:t>
+      </w:r>
+      <w:r>
+        <w:rPr>
+          <w:rFonts w:ascii="Bookman Old Style" w:hAnsi="Bookman Old Style"/>
+          <w:color w:val="000000" w:themeColor="text1"/>
+          <w:lang w:val="en-RW"/>
+        </w:rPr>
+        <w:br/>
         <w:t xml:space="preserve">        </w:t>
       </w:r>
       <w:proofErr w:type="spellStart"/>
@@ -6915,6 +6907,7 @@
         <w:rPr>
           <w:rFonts w:ascii="Bookman Old Style" w:hAnsi="Bookman Old Style"/>
           <w:color w:val="000000" w:themeColor="text1"/>
+          <w:lang w:val="en-RW"/>
         </w:rPr>
         <w:t>reference_id</w:t>
       </w:r>
@@ -6923,24 +6916,152 @@
         <w:rPr>
           <w:rFonts w:ascii="Bookman Old Style" w:hAnsi="Bookman Old Style"/>
           <w:color w:val="000000" w:themeColor="text1"/>
+          <w:lang w:val="en-RW"/>
+        </w:rPr>
+        <w:br/>
+        <w:t xml:space="preserve">        </w:t>
+      </w:r>
+      <w:proofErr w:type="spellStart"/>
+      <w:r>
+        <w:rPr>
+          <w:rFonts w:ascii="Bookman Old Style" w:hAnsi="Bookman Old Style"/>
+          <w:color w:val="000000" w:themeColor="text1"/>
+          <w:lang w:val="en-RW"/>
+        </w:rPr>
+        <w:t>transaction_id</w:t>
+      </w:r>
+      <w:proofErr w:type="spellEnd"/>
+      <w:r>
+        <w:rPr>
+          <w:rFonts w:ascii="Bookman Old Style" w:hAnsi="Bookman Old Style"/>
+          <w:color w:val="000000" w:themeColor="text1"/>
+          <w:lang w:val="en-RW"/>
+        </w:rPr>
+        <w:br/>
+        <w:t xml:space="preserve">        status</w:t>
+      </w:r>
+      <w:r>
+        <w:rPr>
+          <w:rFonts w:ascii="Bookman Old Style" w:hAnsi="Bookman Old Style"/>
+          <w:color w:val="000000" w:themeColor="text1"/>
+          <w:lang w:val="en-RW"/>
+        </w:rPr>
+        <w:br/>
+        <w:t xml:space="preserve">        action</w:t>
+      </w:r>
+      <w:r>
+        <w:rPr>
+          <w:rFonts w:ascii="Bookman Old Style" w:hAnsi="Bookman Old Style"/>
+          <w:color w:val="000000" w:themeColor="text1"/>
+          <w:lang w:val="en-RW"/>
+        </w:rPr>
+        <w:br/>
+      </w:r>
+      <w:r>
+        <w:rPr>
+          <w:rFonts w:ascii="Bookman Old Style" w:hAnsi="Bookman Old Style"/>
+          <w:color w:val="000000" w:themeColor="text1"/>
+          <w:lang w:val="en-RW"/>
+        </w:rPr>
+        <w:br/>
+        <w:t xml:space="preserve">        </w:t>
+      </w:r>
+      <w:proofErr w:type="spellStart"/>
+      <w:r>
+        <w:rPr>
+          <w:rFonts w:ascii="Bookman Old Style" w:hAnsi="Bookman Old Style"/>
+          <w:color w:val="000000" w:themeColor="text1"/>
+          <w:lang w:val="en-RW"/>
+        </w:rPr>
+        <w:t>reference_id</w:t>
+      </w:r>
+      <w:proofErr w:type="spellEnd"/>
+      <w:r>
+        <w:rPr>
+          <w:rFonts w:ascii="Bookman Old Style" w:hAnsi="Bookman Old Style"/>
+          <w:color w:val="000000" w:themeColor="text1"/>
+          <w:lang w:val="en-RW"/>
+        </w:rPr>
+        <w:t xml:space="preserve">   = </w:t>
+      </w:r>
+      <w:proofErr w:type="spellStart"/>
+      <w:r>
+        <w:rPr>
+          <w:rFonts w:ascii="Bookman Old Style" w:hAnsi="Bookman Old Style"/>
+          <w:color w:val="000000" w:themeColor="text1"/>
+          <w:lang w:val="en-RW"/>
+        </w:rPr>
+        <w:t>callbackData</w:t>
+      </w:r>
+      <w:proofErr w:type="spellEnd"/>
+      <w:r>
+        <w:rPr>
+          <w:rFonts w:ascii="Bookman Old Style" w:hAnsi="Bookman Old Style"/>
+          <w:color w:val="000000" w:themeColor="text1"/>
+          <w:lang w:val="en-RW"/>
+        </w:rPr>
+        <w:t>["</w:t>
+      </w:r>
+      <w:proofErr w:type="spellStart"/>
+      <w:r>
+        <w:rPr>
+          <w:rFonts w:ascii="Bookman Old Style" w:hAnsi="Bookman Old Style"/>
+          <w:color w:val="000000" w:themeColor="text1"/>
+          <w:lang w:val="en-RW"/>
+        </w:rPr>
+        <w:t>reference_id</w:t>
+      </w:r>
+      <w:proofErr w:type="spellEnd"/>
+      <w:r>
+        <w:rPr>
+          <w:rFonts w:ascii="Bookman Old Style" w:hAnsi="Bookman Old Style"/>
+          <w:color w:val="000000" w:themeColor="text1"/>
+          <w:lang w:val="en-RW"/>
+        </w:rPr>
+        <w:t>"]</w:t>
+      </w:r>
+      <w:r>
+        <w:rPr>
+          <w:rFonts w:ascii="Bookman Old Style" w:hAnsi="Bookman Old Style"/>
+          <w:color w:val="000000" w:themeColor="text1"/>
+          <w:lang w:val="en-RW"/>
+        </w:rPr>
+        <w:br/>
+        <w:t xml:space="preserve">        </w:t>
+      </w:r>
+      <w:proofErr w:type="spellStart"/>
+      <w:r>
+        <w:rPr>
+          <w:rFonts w:ascii="Bookman Old Style" w:hAnsi="Bookman Old Style"/>
+          <w:color w:val="000000" w:themeColor="text1"/>
+          <w:lang w:val="en-RW"/>
+        </w:rPr>
+        <w:t>transaction_id</w:t>
+      </w:r>
+      <w:proofErr w:type="spellEnd"/>
+      <w:r>
+        <w:rPr>
+          <w:rFonts w:ascii="Bookman Old Style" w:hAnsi="Bookman Old Style"/>
+          <w:color w:val="000000" w:themeColor="text1"/>
+          <w:lang w:val="en-RW"/>
         </w:rPr>
         <w:t xml:space="preserve"> = </w:t>
       </w:r>
       <w:proofErr w:type="spellStart"/>
-      <w:proofErr w:type="gramStart"/>
-      <w:r>
-        <w:rPr>
-          <w:rFonts w:ascii="Bookman Old Style" w:hAnsi="Bookman Old Style"/>
-          <w:color w:val="000000" w:themeColor="text1"/>
-        </w:rPr>
-        <w:t>request.form</w:t>
+      <w:r>
+        <w:rPr>
+          <w:rFonts w:ascii="Bookman Old Style" w:hAnsi="Bookman Old Style"/>
+          <w:color w:val="000000" w:themeColor="text1"/>
+          <w:lang w:val="en-RW"/>
+        </w:rPr>
+        <w:t>callbackData</w:t>
       </w:r>
       <w:proofErr w:type="spellEnd"/>
-      <w:proofErr w:type="gramEnd"/>
-      <w:r>
-        <w:rPr>
-          <w:rFonts w:ascii="Bookman Old Style" w:hAnsi="Bookman Old Style"/>
-          <w:color w:val="000000" w:themeColor="text1"/>
+      <w:r>
+        <w:rPr>
+          <w:rFonts w:ascii="Bookman Old Style" w:hAnsi="Bookman Old Style"/>
+          <w:color w:val="000000" w:themeColor="text1"/>
+          <w:lang w:val="en-RW"/>
         </w:rPr>
         <w:t>["</w:t>
       </w:r>
@@ -6949,830 +7070,423 @@
         <w:rPr>
           <w:rFonts w:ascii="Bookman Old Style" w:hAnsi="Bookman Old Style"/>
           <w:color w:val="000000" w:themeColor="text1"/>
-        </w:rPr>
-        <w:t>pesapal_merchant_reference</w:t>
+          <w:lang w:val="en-RW"/>
+        </w:rPr>
+        <w:t>transaction_id</w:t>
       </w:r>
       <w:proofErr w:type="spellEnd"/>
       <w:r>
         <w:rPr>
           <w:rFonts w:ascii="Bookman Old Style" w:hAnsi="Bookman Old Style"/>
           <w:color w:val="000000" w:themeColor="text1"/>
+          <w:lang w:val="en-RW"/>
         </w:rPr>
         <w:t>"]</w:t>
       </w:r>
-    </w:p>
-    <w:p>
-      <w:pPr>
-        <w:rPr>
-          <w:rFonts w:ascii="Bookman Old Style" w:hAnsi="Bookman Old Style"/>
-          <w:color w:val="000000" w:themeColor="text1"/>
-        </w:rPr>
-      </w:pPr>
-      <w:r>
-        <w:rPr>
-          <w:rFonts w:ascii="Bookman Old Style" w:hAnsi="Bookman Old Style"/>
-          <w:color w:val="000000" w:themeColor="text1"/>
-        </w:rPr>
-        <w:t xml:space="preserve">        </w:t>
+      <w:r>
+        <w:rPr>
+          <w:rFonts w:ascii="Bookman Old Style" w:hAnsi="Bookman Old Style"/>
+          <w:color w:val="000000" w:themeColor="text1"/>
+          <w:lang w:val="en-RW"/>
+        </w:rPr>
+        <w:br/>
+        <w:t xml:space="preserve">        status         = </w:t>
       </w:r>
       <w:proofErr w:type="spellStart"/>
       <w:r>
         <w:rPr>
           <w:rFonts w:ascii="Bookman Old Style" w:hAnsi="Bookman Old Style"/>
           <w:color w:val="000000" w:themeColor="text1"/>
-        </w:rPr>
-        <w:t>transaction_id</w:t>
+          <w:lang w:val="en-RW"/>
+        </w:rPr>
+        <w:t>callbackData</w:t>
       </w:r>
       <w:proofErr w:type="spellEnd"/>
       <w:r>
         <w:rPr>
           <w:rFonts w:ascii="Bookman Old Style" w:hAnsi="Bookman Old Style"/>
           <w:color w:val="000000" w:themeColor="text1"/>
-        </w:rPr>
-        <w:t xml:space="preserve"> = </w:t>
+          <w:lang w:val="en-RW"/>
+        </w:rPr>
+        <w:t>["status"]</w:t>
+      </w:r>
+      <w:r>
+        <w:rPr>
+          <w:rFonts w:ascii="Bookman Old Style" w:hAnsi="Bookman Old Style"/>
+          <w:color w:val="000000" w:themeColor="text1"/>
+          <w:lang w:val="en-RW"/>
+        </w:rPr>
+        <w:br/>
+        <w:t xml:space="preserve">        action         = </w:t>
       </w:r>
       <w:proofErr w:type="spellStart"/>
-      <w:proofErr w:type="gramStart"/>
-      <w:r>
-        <w:rPr>
-          <w:rFonts w:ascii="Bookman Old Style" w:hAnsi="Bookman Old Style"/>
-          <w:color w:val="000000" w:themeColor="text1"/>
-        </w:rPr>
-        <w:t>request.form</w:t>
+      <w:r>
+        <w:rPr>
+          <w:rFonts w:ascii="Bookman Old Style" w:hAnsi="Bookman Old Style"/>
+          <w:color w:val="000000" w:themeColor="text1"/>
+          <w:lang w:val="en-RW"/>
+        </w:rPr>
+        <w:t>callbackData</w:t>
       </w:r>
       <w:proofErr w:type="spellEnd"/>
-      <w:proofErr w:type="gramEnd"/>
-      <w:r>
-        <w:rPr>
-          <w:rFonts w:ascii="Bookman Old Style" w:hAnsi="Bookman Old Style"/>
-          <w:color w:val="000000" w:themeColor="text1"/>
-        </w:rPr>
-        <w:t>["</w:t>
+      <w:r>
+        <w:rPr>
+          <w:rFonts w:ascii="Bookman Old Style" w:hAnsi="Bookman Old Style"/>
+          <w:color w:val="000000" w:themeColor="text1"/>
+          <w:lang w:val="en-RW"/>
+        </w:rPr>
+        <w:t>["action"]</w:t>
+      </w:r>
+      <w:r>
+        <w:rPr>
+          <w:rFonts w:ascii="Bookman Old Style" w:hAnsi="Bookman Old Style"/>
+          <w:color w:val="000000" w:themeColor="text1"/>
+          <w:lang w:val="en-RW"/>
+        </w:rPr>
+        <w:br/>
+      </w:r>
+      <w:r>
+        <w:rPr>
+          <w:rFonts w:ascii="Bookman Old Style" w:hAnsi="Bookman Old Style"/>
+          <w:color w:val="000000" w:themeColor="text1"/>
+          <w:lang w:val="en-RW"/>
+        </w:rPr>
+        <w:br/>
+        <w:t xml:space="preserve">    ELSE</w:t>
+      </w:r>
+      <w:r>
+        <w:rPr>
+          <w:rFonts w:ascii="Bookman Old Style" w:hAnsi="Bookman Old Style"/>
+          <w:color w:val="000000" w:themeColor="text1"/>
+          <w:lang w:val="en-RW"/>
+        </w:rPr>
+        <w:br/>
+        <w:t xml:space="preserve">        RETURN </w:t>
       </w:r>
       <w:proofErr w:type="spellStart"/>
       <w:r>
         <w:rPr>
           <w:rFonts w:ascii="Bookman Old Style" w:hAnsi="Bookman Old Style"/>
           <w:color w:val="000000" w:themeColor="text1"/>
-        </w:rPr>
-        <w:t>pesapal_transaction_tracking_id</w:t>
+          <w:lang w:val="en-RW"/>
+        </w:rPr>
+        <w:t>error_response</w:t>
       </w:r>
       <w:proofErr w:type="spellEnd"/>
       <w:r>
         <w:rPr>
           <w:rFonts w:ascii="Bookman Old Style" w:hAnsi="Bookman Old Style"/>
           <w:color w:val="000000" w:themeColor="text1"/>
-        </w:rPr>
-        <w:t>"]</w:t>
-      </w:r>
-    </w:p>
-    <w:p>
-      <w:pPr>
-        <w:rPr>
-          <w:rFonts w:ascii="Bookman Old Style" w:hAnsi="Bookman Old Style"/>
-          <w:color w:val="000000" w:themeColor="text1"/>
-        </w:rPr>
-      </w:pPr>
-      <w:r>
-        <w:rPr>
-          <w:rFonts w:ascii="Bookman Old Style" w:hAnsi="Bookman Old Style"/>
-          <w:color w:val="000000" w:themeColor="text1"/>
-        </w:rPr>
-        <w:t xml:space="preserve">        response = </w:t>
+          <w:lang w:val="en-RW"/>
+        </w:rPr>
+        <w:t>("Invalid callback data")</w:t>
+      </w:r>
+      <w:r>
+        <w:rPr>
+          <w:rFonts w:ascii="Bookman Old Style" w:hAnsi="Bookman Old Style"/>
+          <w:color w:val="000000" w:themeColor="text1"/>
+          <w:lang w:val="en-RW"/>
+        </w:rPr>
+        <w:br/>
+      </w:r>
+      <w:r>
+        <w:rPr>
+          <w:rFonts w:ascii="Bookman Old Style" w:hAnsi="Bookman Old Style"/>
+          <w:color w:val="000000" w:themeColor="text1"/>
+          <w:lang w:val="en-RW"/>
+        </w:rPr>
+        <w:br/>
+      </w:r>
+      <w:r>
+        <w:rPr>
+          <w:rFonts w:ascii="Bookman Old Style" w:hAnsi="Bookman Old Style"/>
+          <w:color w:val="000000" w:themeColor="text1"/>
+          <w:lang w:val="en-RW"/>
+        </w:rPr>
+        <w:br/>
+        <w:t xml:space="preserve">    // Step 3: Process the payment callback</w:t>
+      </w:r>
+      <w:r>
+        <w:rPr>
+          <w:rFonts w:ascii="Bookman Old Style" w:hAnsi="Bookman Old Style"/>
+          <w:color w:val="000000" w:themeColor="text1"/>
+          <w:lang w:val="en-RW"/>
+        </w:rPr>
+        <w:br/>
+        <w:t xml:space="preserve">    response = </w:t>
       </w:r>
       <w:proofErr w:type="spellStart"/>
-      <w:proofErr w:type="gramStart"/>
-      <w:r>
-        <w:rPr>
-          <w:rFonts w:ascii="Bookman Old Style" w:hAnsi="Bookman Old Style"/>
-          <w:color w:val="000000" w:themeColor="text1"/>
-        </w:rPr>
-        <w:t>request.form</w:t>
+      <w:r>
+        <w:rPr>
+          <w:rFonts w:ascii="Bookman Old Style" w:hAnsi="Bookman Old Style"/>
+          <w:color w:val="000000" w:themeColor="text1"/>
+          <w:lang w:val="en-RW"/>
+        </w:rPr>
+        <w:t>paymentSystem.receiveCallback</w:t>
       </w:r>
       <w:proofErr w:type="spellEnd"/>
-      <w:proofErr w:type="gramEnd"/>
-      <w:r>
-        <w:rPr>
-          <w:rFonts w:ascii="Bookman Old Style" w:hAnsi="Bookman Old Style"/>
-          <w:color w:val="000000" w:themeColor="text1"/>
-        </w:rPr>
-        <w:t>["</w:t>
+      <w:r>
+        <w:rPr>
+          <w:rFonts w:ascii="Bookman Old Style" w:hAnsi="Bookman Old Style"/>
+          <w:color w:val="000000" w:themeColor="text1"/>
+          <w:lang w:val="en-RW"/>
+        </w:rPr>
+        <w:t>(</w:t>
       </w:r>
       <w:proofErr w:type="spellStart"/>
       <w:r>
         <w:rPr>
           <w:rFonts w:ascii="Bookman Old Style" w:hAnsi="Bookman Old Style"/>
           <w:color w:val="000000" w:themeColor="text1"/>
-        </w:rPr>
-        <w:t>pesapal_response_data</w:t>
+          <w:lang w:val="en-RW"/>
+        </w:rPr>
+        <w:t>callbackData</w:t>
       </w:r>
       <w:proofErr w:type="spellEnd"/>
       <w:r>
         <w:rPr>
           <w:rFonts w:ascii="Bookman Old Style" w:hAnsi="Bookman Old Style"/>
           <w:color w:val="000000" w:themeColor="text1"/>
-        </w:rPr>
-        <w:t>"]</w:t>
-      </w:r>
-    </w:p>
-    <w:p>
-      <w:pPr>
-        <w:rPr>
-          <w:rFonts w:ascii="Bookman Old Style" w:hAnsi="Bookman Old Style"/>
-          <w:color w:val="000000" w:themeColor="text1"/>
-        </w:rPr>
-      </w:pPr>
-      <w:r>
-        <w:rPr>
-          <w:rFonts w:ascii="Bookman Old Style" w:hAnsi="Bookman Old Style"/>
-          <w:color w:val="000000" w:themeColor="text1"/>
-        </w:rPr>
-        <w:t xml:space="preserve">        </w:t>
-      </w:r>
-    </w:p>
-    <w:p>
-      <w:pPr>
-        <w:rPr>
-          <w:rFonts w:ascii="Bookman Old Style" w:hAnsi="Bookman Old Style"/>
-          <w:color w:val="000000" w:themeColor="text1"/>
-        </w:rPr>
-      </w:pPr>
-      <w:r>
-        <w:rPr>
-          <w:rFonts w:ascii="Bookman Old Style" w:hAnsi="Bookman Old Style"/>
-          <w:color w:val="000000" w:themeColor="text1"/>
-        </w:rPr>
-        <w:t xml:space="preserve">        IF response == "COMPLETED":</w:t>
-      </w:r>
-    </w:p>
-    <w:p>
-      <w:pPr>
-        <w:rPr>
-          <w:rFonts w:ascii="Bookman Old Style" w:hAnsi="Bookman Old Style"/>
-          <w:color w:val="000000" w:themeColor="text1"/>
-        </w:rPr>
-      </w:pPr>
-      <w:r>
-        <w:rPr>
-          <w:rFonts w:ascii="Bookman Old Style" w:hAnsi="Bookman Old Style"/>
-          <w:color w:val="000000" w:themeColor="text1"/>
-        </w:rPr>
-        <w:t xml:space="preserve">            status = "success"</w:t>
-      </w:r>
-    </w:p>
-    <w:p>
-      <w:pPr>
-        <w:rPr>
-          <w:rFonts w:ascii="Bookman Old Style" w:hAnsi="Bookman Old Style"/>
-          <w:color w:val="000000" w:themeColor="text1"/>
-        </w:rPr>
-      </w:pPr>
-      <w:r>
-        <w:rPr>
-          <w:rFonts w:ascii="Bookman Old Style" w:hAnsi="Bookman Old Style"/>
-          <w:color w:val="000000" w:themeColor="text1"/>
-        </w:rPr>
-        <w:t xml:space="preserve">        ELSE:</w:t>
-      </w:r>
-    </w:p>
-    <w:p>
-      <w:pPr>
-        <w:rPr>
-          <w:rFonts w:ascii="Bookman Old Style" w:hAnsi="Bookman Old Style"/>
-          <w:color w:val="000000" w:themeColor="text1"/>
-        </w:rPr>
-      </w:pPr>
-      <w:r>
-        <w:rPr>
-          <w:rFonts w:ascii="Bookman Old Style" w:hAnsi="Bookman Old Style"/>
-          <w:color w:val="000000" w:themeColor="text1"/>
-        </w:rPr>
-        <w:t xml:space="preserve">            status = "failed"</w:t>
-      </w:r>
-    </w:p>
-    <w:p>
-      <w:pPr>
-        <w:rPr>
-          <w:rFonts w:ascii="Bookman Old Style" w:hAnsi="Bookman Old Style"/>
-          <w:color w:val="000000" w:themeColor="text1"/>
-        </w:rPr>
-      </w:pPr>
-      <w:r>
-        <w:rPr>
-          <w:rFonts w:ascii="Bookman Old Style" w:hAnsi="Bookman Old Style"/>
-          <w:color w:val="000000" w:themeColor="text1"/>
-        </w:rPr>
+          <w:lang w:val="en-RW"/>
+        </w:rPr>
+        <w:t>)</w:t>
+      </w:r>
+      <w:r>
+        <w:rPr>
+          <w:rFonts w:ascii="Bookman Old Style" w:hAnsi="Bookman Old Style"/>
+          <w:color w:val="000000" w:themeColor="text1"/>
+          <w:lang w:val="en-RW"/>
+        </w:rPr>
+        <w:br/>
+      </w:r>
+      <w:r>
+        <w:rPr>
+          <w:rFonts w:ascii="Bookman Old Style" w:hAnsi="Bookman Old Style"/>
+          <w:color w:val="000000" w:themeColor="text1"/>
+          <w:lang w:val="en-RW"/>
+        </w:rPr>
+        <w:br/>
+      </w:r>
+      <w:r>
+        <w:rPr>
+          <w:rFonts w:ascii="Bookman Old Style" w:hAnsi="Bookman Old Style"/>
+          <w:color w:val="000000" w:themeColor="text1"/>
+          <w:lang w:val="en-RW"/>
+        </w:rPr>
+        <w:br/>
+        <w:t xml:space="preserve">    // Step 4: Log callback for debugging</w:t>
+      </w:r>
+      <w:r>
+        <w:rPr>
+          <w:rFonts w:ascii="Bookman Old Style" w:hAnsi="Bookman Old Style"/>
+          <w:color w:val="000000" w:themeColor="text1"/>
+          <w:lang w:val="en-RW"/>
+        </w:rPr>
+        <w:br/>
         <w:t xml:space="preserve">    </w:t>
       </w:r>
-    </w:p>
-    <w:p>
-      <w:pPr>
-        <w:rPr>
-          <w:rFonts w:ascii="Bookman Old Style" w:hAnsi="Bookman Old Style"/>
-          <w:color w:val="000000" w:themeColor="text1"/>
-        </w:rPr>
-      </w:pPr>
-      <w:r>
-        <w:rPr>
-          <w:rFonts w:ascii="Bookman Old Style" w:hAnsi="Bookman Old Style"/>
-          <w:color w:val="000000" w:themeColor="text1"/>
-        </w:rPr>
-        <w:t xml:space="preserve">    ELSE IF request has JSON body:</w:t>
-      </w:r>
-    </w:p>
-    <w:p>
-      <w:pPr>
-        <w:rPr>
-          <w:rFonts w:ascii="Bookman Old Style" w:hAnsi="Bookman Old Style"/>
-          <w:color w:val="000000" w:themeColor="text1"/>
-        </w:rPr>
-      </w:pPr>
-      <w:r>
-        <w:rPr>
-          <w:rFonts w:ascii="Bookman Old Style" w:hAnsi="Bookman Old Style"/>
-          <w:color w:val="000000" w:themeColor="text1"/>
-        </w:rPr>
-        <w:t xml:space="preserve">        data = </w:t>
-      </w:r>
       <w:proofErr w:type="spellStart"/>
       <w:r>
         <w:rPr>
           <w:rFonts w:ascii="Bookman Old Style" w:hAnsi="Bookman Old Style"/>
           <w:color w:val="000000" w:themeColor="text1"/>
-        </w:rPr>
-        <w:t>parse_json</w:t>
+          <w:lang w:val="en-RW"/>
+        </w:rPr>
+        <w:t>write_to_log</w:t>
       </w:r>
       <w:proofErr w:type="spellEnd"/>
       <w:r>
         <w:rPr>
           <w:rFonts w:ascii="Bookman Old Style" w:hAnsi="Bookman Old Style"/>
           <w:color w:val="000000" w:themeColor="text1"/>
+          <w:lang w:val="en-RW"/>
         </w:rPr>
         <w:t>(</w:t>
       </w:r>
+      <w:r>
+        <w:rPr>
+          <w:rFonts w:ascii="Bookman Old Style" w:hAnsi="Bookman Old Style"/>
+          <w:color w:val="000000" w:themeColor="text1"/>
+          <w:lang w:val="en-RW"/>
+        </w:rPr>
+        <w:br/>
+        <w:t xml:space="preserve">        "Callback processed: " + </w:t>
+      </w:r>
       <w:proofErr w:type="spellStart"/>
-      <w:proofErr w:type="gramStart"/>
-      <w:r>
-        <w:rPr>
-          <w:rFonts w:ascii="Bookman Old Style" w:hAnsi="Bookman Old Style"/>
-          <w:color w:val="000000" w:themeColor="text1"/>
-        </w:rPr>
-        <w:t>request.body</w:t>
+      <w:r>
+        <w:rPr>
+          <w:rFonts w:ascii="Bookman Old Style" w:hAnsi="Bookman Old Style"/>
+          <w:color w:val="000000" w:themeColor="text1"/>
+          <w:lang w:val="en-RW"/>
+        </w:rPr>
+        <w:t>reference_id</w:t>
       </w:r>
       <w:proofErr w:type="spellEnd"/>
-      <w:proofErr w:type="gramEnd"/>
-      <w:r>
-        <w:rPr>
-          <w:rFonts w:ascii="Bookman Old Style" w:hAnsi="Bookman Old Style"/>
-          <w:color w:val="000000" w:themeColor="text1"/>
-        </w:rPr>
-        <w:t>)</w:t>
-      </w:r>
-    </w:p>
-    <w:p>
-      <w:pPr>
-        <w:rPr>
-          <w:rFonts w:ascii="Bookman Old Style" w:hAnsi="Bookman Old Style"/>
-          <w:color w:val="000000" w:themeColor="text1"/>
-        </w:rPr>
-      </w:pPr>
-      <w:r>
-        <w:rPr>
-          <w:rFonts w:ascii="Bookman Old Style" w:hAnsi="Bookman Old Style"/>
-          <w:color w:val="000000" w:themeColor="text1"/>
-        </w:rPr>
-        <w:t xml:space="preserve">        </w:t>
+      <w:r>
+        <w:rPr>
+          <w:rFonts w:ascii="Bookman Old Style" w:hAnsi="Bookman Old Style"/>
+          <w:color w:val="000000" w:themeColor="text1"/>
+          <w:lang w:val="en-RW"/>
+        </w:rPr>
+        <w:t xml:space="preserve"> +</w:t>
+      </w:r>
+      <w:r>
+        <w:rPr>
+          <w:rFonts w:ascii="Bookman Old Style" w:hAnsi="Bookman Old Style"/>
+          <w:color w:val="000000" w:themeColor="text1"/>
+          <w:lang w:val="en-RW"/>
+        </w:rPr>
+        <w:br/>
+        <w:t xml:space="preserve">        ", Status: " + status</w:t>
+      </w:r>
+      <w:r>
+        <w:rPr>
+          <w:rFonts w:ascii="Bookman Old Style" w:hAnsi="Bookman Old Style"/>
+          <w:color w:val="000000" w:themeColor="text1"/>
+          <w:lang w:val="en-RW"/>
+        </w:rPr>
+        <w:br/>
+        <w:t xml:space="preserve">    )</w:t>
+      </w:r>
+      <w:r>
+        <w:rPr>
+          <w:rFonts w:ascii="Bookman Old Style" w:hAnsi="Bookman Old Style"/>
+          <w:color w:val="000000" w:themeColor="text1"/>
+          <w:lang w:val="en-RW"/>
+        </w:rPr>
+        <w:br/>
+      </w:r>
+      <w:r>
+        <w:rPr>
+          <w:rFonts w:ascii="Bookman Old Style" w:hAnsi="Bookman Old Style"/>
+          <w:color w:val="000000" w:themeColor="text1"/>
+          <w:lang w:val="en-RW"/>
+        </w:rPr>
+        <w:br/>
+      </w:r>
+      <w:r>
+        <w:rPr>
+          <w:rFonts w:ascii="Bookman Old Style" w:hAnsi="Bookman Old Style"/>
+          <w:color w:val="000000" w:themeColor="text1"/>
+          <w:lang w:val="en-RW"/>
+        </w:rPr>
+        <w:br/>
+        <w:t xml:space="preserve">    // Step 5: Return success acknowledgment</w:t>
+      </w:r>
+      <w:r>
+        <w:rPr>
+          <w:rFonts w:ascii="Bookman Old Style" w:hAnsi="Bookman Old Style"/>
+          <w:color w:val="000000" w:themeColor="text1"/>
+          <w:lang w:val="en-RW"/>
+        </w:rPr>
+        <w:br/>
+        <w:t xml:space="preserve">    RETURN </w:t>
       </w:r>
       <w:proofErr w:type="spellStart"/>
       <w:r>
         <w:rPr>
           <w:rFonts w:ascii="Bookman Old Style" w:hAnsi="Bookman Old Style"/>
           <w:color w:val="000000" w:themeColor="text1"/>
-        </w:rPr>
-        <w:t>reference_id</w:t>
+          <w:lang w:val="en-RW"/>
+        </w:rPr>
+        <w:t>success_response</w:t>
       </w:r>
       <w:proofErr w:type="spellEnd"/>
       <w:r>
         <w:rPr>
           <w:rFonts w:ascii="Bookman Old Style" w:hAnsi="Bookman Old Style"/>
           <w:color w:val="000000" w:themeColor="text1"/>
-        </w:rPr>
-        <w:t xml:space="preserve"> = data["</w:t>
+          <w:lang w:val="en-RW"/>
+        </w:rPr>
+        <w:t>(</w:t>
+      </w:r>
+      <w:r>
+        <w:rPr>
+          <w:rFonts w:ascii="Bookman Old Style" w:hAnsi="Bookman Old Style"/>
+          <w:color w:val="000000" w:themeColor="text1"/>
+          <w:lang w:val="en-RW"/>
+        </w:rPr>
+        <w:br/>
+        <w:t xml:space="preserve">        {</w:t>
+      </w:r>
+      <w:r>
+        <w:rPr>
+          <w:rFonts w:ascii="Bookman Old Style" w:hAnsi="Bookman Old Style"/>
+          <w:color w:val="000000" w:themeColor="text1"/>
+          <w:lang w:val="en-RW"/>
+        </w:rPr>
+        <w:br/>
+        <w:t xml:space="preserve">            "status": true,</w:t>
+      </w:r>
+      <w:r>
+        <w:rPr>
+          <w:rFonts w:ascii="Bookman Old Style" w:hAnsi="Bookman Old Style"/>
+          <w:color w:val="000000" w:themeColor="text1"/>
+          <w:lang w:val="en-RW"/>
+        </w:rPr>
+        <w:br/>
+        <w:t xml:space="preserve">            "message": "Callback received and processed",</w:t>
+      </w:r>
+      <w:r>
+        <w:rPr>
+          <w:rFonts w:ascii="Bookman Old Style" w:hAnsi="Bookman Old Style"/>
+          <w:color w:val="000000" w:themeColor="text1"/>
+          <w:lang w:val="en-RW"/>
+        </w:rPr>
+        <w:br/>
+      </w:r>
+      <w:r>
+        <w:rPr>
+          <w:rFonts w:ascii="Bookman Old Style" w:hAnsi="Bookman Old Style"/>
+          <w:color w:val="000000" w:themeColor="text1"/>
+          <w:lang w:val="en-RW"/>
+        </w:rPr>
+        <w:lastRenderedPageBreak/>
+        <w:t xml:space="preserve">            "data": response,</w:t>
+      </w:r>
+      <w:r>
+        <w:rPr>
+          <w:rFonts w:ascii="Bookman Old Style" w:hAnsi="Bookman Old Style"/>
+          <w:color w:val="000000" w:themeColor="text1"/>
+          <w:lang w:val="en-RW"/>
+        </w:rPr>
+        <w:br/>
+        <w:t xml:space="preserve">            "</w:t>
       </w:r>
       <w:proofErr w:type="spellStart"/>
       <w:r>
         <w:rPr>
           <w:rFonts w:ascii="Bookman Old Style" w:hAnsi="Bookman Old Style"/>
           <w:color w:val="000000" w:themeColor="text1"/>
-        </w:rPr>
-        <w:t>reference_id</w:t>
+          <w:lang w:val="en-RW"/>
+        </w:rPr>
+        <w:t>site_url</w:t>
       </w:r>
       <w:proofErr w:type="spellEnd"/>
       <w:r>
         <w:rPr>
           <w:rFonts w:ascii="Bookman Old Style" w:hAnsi="Bookman Old Style"/>
           <w:color w:val="000000" w:themeColor="text1"/>
-        </w:rPr>
-        <w:t>"]</w:t>
-      </w:r>
-    </w:p>
-    <w:p>
-      <w:pPr>
-        <w:rPr>
-          <w:rFonts w:ascii="Bookman Old Style" w:hAnsi="Bookman Old Style"/>
-          <w:color w:val="000000" w:themeColor="text1"/>
-        </w:rPr>
-      </w:pPr>
-      <w:r>
-        <w:rPr>
-          <w:rFonts w:ascii="Bookman Old Style" w:hAnsi="Bookman Old Style"/>
-          <w:color w:val="000000" w:themeColor="text1"/>
-        </w:rPr>
-        <w:t xml:space="preserve">        </w:t>
-      </w:r>
-      <w:proofErr w:type="spellStart"/>
-      <w:r>
-        <w:rPr>
-          <w:rFonts w:ascii="Bookman Old Style" w:hAnsi="Bookman Old Style"/>
-          <w:color w:val="000000" w:themeColor="text1"/>
-        </w:rPr>
-        <w:t>transaction_id</w:t>
-      </w:r>
-      <w:proofErr w:type="spellEnd"/>
-      <w:r>
-        <w:rPr>
-          <w:rFonts w:ascii="Bookman Old Style" w:hAnsi="Bookman Old Style"/>
-          <w:color w:val="000000" w:themeColor="text1"/>
-        </w:rPr>
-        <w:t xml:space="preserve"> = data["</w:t>
-      </w:r>
-      <w:proofErr w:type="spellStart"/>
-      <w:r>
-        <w:rPr>
-          <w:rFonts w:ascii="Bookman Old Style" w:hAnsi="Bookman Old Style"/>
-          <w:color w:val="000000" w:themeColor="text1"/>
-        </w:rPr>
-        <w:t>transaction_id</w:t>
-      </w:r>
-      <w:proofErr w:type="spellEnd"/>
-      <w:r>
-        <w:rPr>
-          <w:rFonts w:ascii="Bookman Old Style" w:hAnsi="Bookman Old Style"/>
-          <w:color w:val="000000" w:themeColor="text1"/>
-        </w:rPr>
-        <w:t>"]</w:t>
-      </w:r>
-    </w:p>
-    <w:p>
-      <w:pPr>
-        <w:rPr>
-          <w:rFonts w:ascii="Bookman Old Style" w:hAnsi="Bookman Old Style"/>
-          <w:color w:val="000000" w:themeColor="text1"/>
-        </w:rPr>
-      </w:pPr>
-      <w:r>
-        <w:rPr>
-          <w:rFonts w:ascii="Bookman Old Style" w:hAnsi="Bookman Old Style"/>
-          <w:color w:val="000000" w:themeColor="text1"/>
-        </w:rPr>
-        <w:t xml:space="preserve">        status = data["status"]</w:t>
-      </w:r>
-    </w:p>
-    <w:p>
-      <w:pPr>
-        <w:rPr>
-          <w:rFonts w:ascii="Bookman Old Style" w:hAnsi="Bookman Old Style"/>
-          <w:color w:val="000000" w:themeColor="text1"/>
-        </w:rPr>
-      </w:pPr>
-      <w:r>
-        <w:rPr>
-          <w:rFonts w:ascii="Bookman Old Style" w:hAnsi="Bookman Old Style"/>
-          <w:color w:val="000000" w:themeColor="text1"/>
-        </w:rPr>
-        <w:t xml:space="preserve">    </w:t>
-      </w:r>
-    </w:p>
-    <w:p>
-      <w:pPr>
-        <w:rPr>
-          <w:rFonts w:ascii="Bookman Old Style" w:hAnsi="Bookman Old Style"/>
-          <w:color w:val="000000" w:themeColor="text1"/>
-        </w:rPr>
-      </w:pPr>
-      <w:r>
-        <w:rPr>
-          <w:rFonts w:ascii="Bookman Old Style" w:hAnsi="Bookman Old Style"/>
-          <w:color w:val="000000" w:themeColor="text1"/>
-        </w:rPr>
-        <w:t xml:space="preserve">    ELSE:</w:t>
-      </w:r>
-    </w:p>
-    <w:p>
-      <w:pPr>
-        <w:rPr>
-          <w:rFonts w:ascii="Bookman Old Style" w:hAnsi="Bookman Old Style"/>
-          <w:color w:val="000000" w:themeColor="text1"/>
-        </w:rPr>
-      </w:pPr>
-      <w:r>
-        <w:rPr>
-          <w:rFonts w:ascii="Bookman Old Style" w:hAnsi="Bookman Old Style"/>
-          <w:color w:val="000000" w:themeColor="text1"/>
-        </w:rPr>
-        <w:t xml:space="preserve">        RETURN </w:t>
-      </w:r>
-      <w:proofErr w:type="spellStart"/>
-      <w:r>
-        <w:rPr>
-          <w:rFonts w:ascii="Bookman Old Style" w:hAnsi="Bookman Old Style"/>
-          <w:color w:val="000000" w:themeColor="text1"/>
-        </w:rPr>
-        <w:t>error_</w:t>
-      </w:r>
-      <w:proofErr w:type="gramStart"/>
-      <w:r>
-        <w:rPr>
-          <w:rFonts w:ascii="Bookman Old Style" w:hAnsi="Bookman Old Style"/>
-          <w:color w:val="000000" w:themeColor="text1"/>
-        </w:rPr>
-        <w:t>response</w:t>
-      </w:r>
-      <w:proofErr w:type="spellEnd"/>
-      <w:r>
-        <w:rPr>
-          <w:rFonts w:ascii="Bookman Old Style" w:hAnsi="Bookman Old Style"/>
-          <w:color w:val="000000" w:themeColor="text1"/>
-        </w:rPr>
-        <w:t>(</w:t>
-      </w:r>
-      <w:proofErr w:type="gramEnd"/>
-      <w:r>
-        <w:rPr>
-          <w:rFonts w:ascii="Bookman Old Style" w:hAnsi="Bookman Old Style"/>
-          <w:color w:val="000000" w:themeColor="text1"/>
-        </w:rPr>
-        <w:t>"Invalid callback data")</w:t>
-      </w:r>
-    </w:p>
-    <w:p>
-      <w:pPr>
-        <w:rPr>
-          <w:rFonts w:ascii="Bookman Old Style" w:hAnsi="Bookman Old Style"/>
-          <w:color w:val="000000" w:themeColor="text1"/>
-        </w:rPr>
-      </w:pPr>
-      <w:r>
-        <w:rPr>
-          <w:rFonts w:ascii="Bookman Old Style" w:hAnsi="Bookman Old Style"/>
-          <w:color w:val="000000" w:themeColor="text1"/>
-        </w:rPr>
-        <w:t xml:space="preserve">    </w:t>
-      </w:r>
-    </w:p>
-    <w:p>
-      <w:pPr>
-        <w:rPr>
-          <w:rFonts w:ascii="Bookman Old Style" w:hAnsi="Bookman Old Style"/>
-          <w:color w:val="000000" w:themeColor="text1"/>
-        </w:rPr>
-      </w:pPr>
-      <w:r>
-        <w:rPr>
-          <w:rFonts w:ascii="Bookman Old Style" w:hAnsi="Bookman Old Style"/>
-          <w:color w:val="000000" w:themeColor="text1"/>
-        </w:rPr>
-        <w:t xml:space="preserve">    // Step 2: Validate required data</w:t>
-      </w:r>
-    </w:p>
-    <w:p>
-      <w:pPr>
-        <w:rPr>
-          <w:rFonts w:ascii="Bookman Old Style" w:hAnsi="Bookman Old Style"/>
-          <w:color w:val="000000" w:themeColor="text1"/>
-        </w:rPr>
-      </w:pPr>
-      <w:r>
-        <w:rPr>
-          <w:rFonts w:ascii="Bookman Old Style" w:hAnsi="Bookman Old Style"/>
-          <w:color w:val="000000" w:themeColor="text1"/>
-        </w:rPr>
-        <w:lastRenderedPageBreak/>
-        <w:t xml:space="preserve">    IF </w:t>
-      </w:r>
-      <w:proofErr w:type="spellStart"/>
-      <w:r>
-        <w:rPr>
-          <w:rFonts w:ascii="Bookman Old Style" w:hAnsi="Bookman Old Style"/>
-          <w:color w:val="000000" w:themeColor="text1"/>
-        </w:rPr>
-        <w:t>reference_id</w:t>
-      </w:r>
-      <w:proofErr w:type="spellEnd"/>
-      <w:r>
-        <w:rPr>
-          <w:rFonts w:ascii="Bookman Old Style" w:hAnsi="Bookman Old Style"/>
-          <w:color w:val="000000" w:themeColor="text1"/>
-        </w:rPr>
-        <w:t xml:space="preserve"> is empty OR </w:t>
-      </w:r>
-      <w:proofErr w:type="spellStart"/>
-      <w:r>
-        <w:rPr>
-          <w:rFonts w:ascii="Bookman Old Style" w:hAnsi="Bookman Old Style"/>
-          <w:color w:val="000000" w:themeColor="text1"/>
-        </w:rPr>
-        <w:t>transaction_id</w:t>
-      </w:r>
-      <w:proofErr w:type="spellEnd"/>
-      <w:r>
-        <w:rPr>
-          <w:rFonts w:ascii="Bookman Old Style" w:hAnsi="Bookman Old Style"/>
-          <w:color w:val="000000" w:themeColor="text1"/>
-        </w:rPr>
-        <w:t xml:space="preserve"> is empty:</w:t>
-      </w:r>
-    </w:p>
-    <w:p>
-      <w:pPr>
-        <w:rPr>
-          <w:rFonts w:ascii="Bookman Old Style" w:hAnsi="Bookman Old Style"/>
-          <w:color w:val="000000" w:themeColor="text1"/>
-        </w:rPr>
-      </w:pPr>
-      <w:r>
-        <w:rPr>
-          <w:rFonts w:ascii="Bookman Old Style" w:hAnsi="Bookman Old Style"/>
-          <w:color w:val="000000" w:themeColor="text1"/>
-        </w:rPr>
-        <w:t xml:space="preserve">        RETURN </w:t>
-      </w:r>
-      <w:proofErr w:type="spellStart"/>
-      <w:r>
-        <w:rPr>
-          <w:rFonts w:ascii="Bookman Old Style" w:hAnsi="Bookman Old Style"/>
-          <w:color w:val="000000" w:themeColor="text1"/>
-        </w:rPr>
-        <w:t>error_</w:t>
-      </w:r>
-      <w:proofErr w:type="gramStart"/>
-      <w:r>
-        <w:rPr>
-          <w:rFonts w:ascii="Bookman Old Style" w:hAnsi="Bookman Old Style"/>
-          <w:color w:val="000000" w:themeColor="text1"/>
-        </w:rPr>
-        <w:t>response</w:t>
-      </w:r>
-      <w:proofErr w:type="spellEnd"/>
-      <w:r>
-        <w:rPr>
-          <w:rFonts w:ascii="Bookman Old Style" w:hAnsi="Bookman Old Style"/>
-          <w:color w:val="000000" w:themeColor="text1"/>
-        </w:rPr>
-        <w:t>(</w:t>
-      </w:r>
-      <w:proofErr w:type="gramEnd"/>
-      <w:r>
-        <w:rPr>
-          <w:rFonts w:ascii="Bookman Old Style" w:hAnsi="Bookman Old Style"/>
-          <w:color w:val="000000" w:themeColor="text1"/>
-        </w:rPr>
-        <w:t>"Missing required fields")</w:t>
-      </w:r>
-    </w:p>
-    <w:p>
-      <w:pPr>
-        <w:rPr>
-          <w:rFonts w:ascii="Bookman Old Style" w:hAnsi="Bookman Old Style"/>
-          <w:color w:val="000000" w:themeColor="text1"/>
-        </w:rPr>
-      </w:pPr>
-      <w:r>
-        <w:rPr>
-          <w:rFonts w:ascii="Bookman Old Style" w:hAnsi="Bookman Old Style"/>
-          <w:color w:val="000000" w:themeColor="text1"/>
-        </w:rPr>
-        <w:t xml:space="preserve">    </w:t>
-      </w:r>
-    </w:p>
-    <w:p>
-      <w:pPr>
-        <w:rPr>
-          <w:rFonts w:ascii="Bookman Old Style" w:hAnsi="Bookman Old Style"/>
-          <w:color w:val="000000" w:themeColor="text1"/>
-        </w:rPr>
-      </w:pPr>
-      <w:r>
-        <w:rPr>
-          <w:rFonts w:ascii="Bookman Old Style" w:hAnsi="Bookman Old Style"/>
-          <w:color w:val="000000" w:themeColor="text1"/>
-        </w:rPr>
-        <w:t xml:space="preserve">    // Step 3: Update your database</w:t>
-      </w:r>
-    </w:p>
-    <w:p>
-      <w:pPr>
-        <w:rPr>
-          <w:rFonts w:ascii="Bookman Old Style" w:hAnsi="Bookman Old Style"/>
-          <w:color w:val="000000" w:themeColor="text1"/>
-        </w:rPr>
-      </w:pPr>
-      <w:r>
-        <w:rPr>
-          <w:rFonts w:ascii="Bookman Old Style" w:hAnsi="Bookman Old Style"/>
-          <w:color w:val="000000" w:themeColor="text1"/>
-        </w:rPr>
-        <w:t xml:space="preserve">    </w:t>
-      </w:r>
-      <w:proofErr w:type="spellStart"/>
-      <w:proofErr w:type="gramStart"/>
-      <w:r>
-        <w:rPr>
-          <w:rFonts w:ascii="Bookman Old Style" w:hAnsi="Bookman Old Style"/>
-          <w:color w:val="000000" w:themeColor="text1"/>
-        </w:rPr>
-        <w:t>database.execute</w:t>
-      </w:r>
-      <w:proofErr w:type="spellEnd"/>
-      <w:proofErr w:type="gramEnd"/>
-      <w:r>
-        <w:rPr>
-          <w:rFonts w:ascii="Bookman Old Style" w:hAnsi="Bookman Old Style"/>
-          <w:color w:val="000000" w:themeColor="text1"/>
-        </w:rPr>
-        <w:t>(</w:t>
-      </w:r>
-    </w:p>
-    <w:p>
-      <w:pPr>
-        <w:rPr>
-          <w:rFonts w:ascii="Bookman Old Style" w:hAnsi="Bookman Old Style"/>
-          <w:color w:val="000000" w:themeColor="text1"/>
-        </w:rPr>
-      </w:pPr>
-      <w:r>
-        <w:rPr>
-          <w:rFonts w:ascii="Bookman Old Style" w:hAnsi="Bookman Old Style"/>
-          <w:color w:val="000000" w:themeColor="text1"/>
-        </w:rPr>
-        <w:t xml:space="preserve">        "UPDATE orders SET </w:t>
-      </w:r>
-      <w:proofErr w:type="spellStart"/>
-      <w:r>
-        <w:rPr>
-          <w:rFonts w:ascii="Bookman Old Style" w:hAnsi="Bookman Old Style"/>
-          <w:color w:val="000000" w:themeColor="text1"/>
-        </w:rPr>
-        <w:t>payment_status</w:t>
-      </w:r>
-      <w:proofErr w:type="spellEnd"/>
-      <w:r>
-        <w:rPr>
-          <w:rFonts w:ascii="Bookman Old Style" w:hAnsi="Bookman Old Style"/>
-          <w:color w:val="000000" w:themeColor="text1"/>
-        </w:rPr>
-        <w:t xml:space="preserve"> </w:t>
-      </w:r>
-      <w:proofErr w:type="gramStart"/>
-      <w:r>
-        <w:rPr>
-          <w:rFonts w:ascii="Bookman Old Style" w:hAnsi="Bookman Old Style"/>
-          <w:color w:val="000000" w:themeColor="text1"/>
-        </w:rPr>
-        <w:t>= ?</w:t>
-      </w:r>
-      <w:proofErr w:type="gramEnd"/>
-      <w:r>
-        <w:rPr>
-          <w:rFonts w:ascii="Bookman Old Style" w:hAnsi="Bookman Old Style"/>
-          <w:color w:val="000000" w:themeColor="text1"/>
-        </w:rPr>
-        <w:t xml:space="preserve">, </w:t>
-      </w:r>
-      <w:proofErr w:type="spellStart"/>
-      <w:r>
-        <w:rPr>
-          <w:rFonts w:ascii="Bookman Old Style" w:hAnsi="Bookman Old Style"/>
-          <w:color w:val="000000" w:themeColor="text1"/>
-        </w:rPr>
-        <w:t>transaction_id</w:t>
-      </w:r>
-      <w:proofErr w:type="spellEnd"/>
-      <w:r>
-        <w:rPr>
-          <w:rFonts w:ascii="Bookman Old Style" w:hAnsi="Bookman Old Style"/>
-          <w:color w:val="000000" w:themeColor="text1"/>
-        </w:rPr>
-        <w:t xml:space="preserve"> </w:t>
-      </w:r>
-      <w:proofErr w:type="gramStart"/>
-      <w:r>
-        <w:rPr>
-          <w:rFonts w:ascii="Bookman Old Style" w:hAnsi="Bookman Old Style"/>
-          <w:color w:val="000000" w:themeColor="text1"/>
-        </w:rPr>
-        <w:t>= ?</w:t>
-      </w:r>
-      <w:proofErr w:type="gramEnd"/>
-      <w:r>
-        <w:rPr>
-          <w:rFonts w:ascii="Bookman Old Style" w:hAnsi="Bookman Old Style"/>
-          <w:color w:val="000000" w:themeColor="text1"/>
-        </w:rPr>
-        <w:t xml:space="preserve"> WHERE </w:t>
-      </w:r>
-      <w:proofErr w:type="spellStart"/>
-      <w:r>
-        <w:rPr>
-          <w:rFonts w:ascii="Bookman Old Style" w:hAnsi="Bookman Old Style"/>
-          <w:color w:val="000000" w:themeColor="text1"/>
-        </w:rPr>
-        <w:t>reference_id</w:t>
-      </w:r>
-      <w:proofErr w:type="spellEnd"/>
-      <w:r>
-        <w:rPr>
-          <w:rFonts w:ascii="Bookman Old Style" w:hAnsi="Bookman Old Style"/>
-          <w:color w:val="000000" w:themeColor="text1"/>
-        </w:rPr>
-        <w:t xml:space="preserve"> </w:t>
-      </w:r>
-      <w:proofErr w:type="gramStart"/>
-      <w:r>
-        <w:rPr>
-          <w:rFonts w:ascii="Bookman Old Style" w:hAnsi="Bookman Old Style"/>
-          <w:color w:val="000000" w:themeColor="text1"/>
-        </w:rPr>
-        <w:t>= ?</w:t>
-      </w:r>
-      <w:proofErr w:type="gramEnd"/>
-      <w:r>
-        <w:rPr>
-          <w:rFonts w:ascii="Bookman Old Style" w:hAnsi="Bookman Old Style"/>
-          <w:color w:val="000000" w:themeColor="text1"/>
-        </w:rPr>
-        <w:t>",</w:t>
-      </w:r>
-    </w:p>
-    <w:p>
-      <w:pPr>
-        <w:rPr>
-          <w:rFonts w:ascii="Bookman Old Style" w:hAnsi="Bookman Old Style"/>
-          <w:color w:val="000000" w:themeColor="text1"/>
-        </w:rPr>
-      </w:pPr>
-      <w:r>
-        <w:rPr>
-          <w:rFonts w:ascii="Bookman Old Style" w:hAnsi="Bookman Old Style"/>
-          <w:color w:val="000000" w:themeColor="text1"/>
-        </w:rPr>
-        <w:t xml:space="preserve">        [status, </w:t>
-      </w:r>
-      <w:proofErr w:type="spellStart"/>
-      <w:r>
-        <w:rPr>
-          <w:rFonts w:ascii="Bookman Old Style" w:hAnsi="Bookman Old Style"/>
-          <w:color w:val="000000" w:themeColor="text1"/>
-        </w:rPr>
-        <w:t>transaction_id</w:t>
-      </w:r>
-      <w:proofErr w:type="spellEnd"/>
-      <w:r>
-        <w:rPr>
-          <w:rFonts w:ascii="Bookman Old Style" w:hAnsi="Bookman Old Style"/>
-          <w:color w:val="000000" w:themeColor="text1"/>
-        </w:rPr>
-        <w:t xml:space="preserve">, </w:t>
-      </w:r>
-      <w:proofErr w:type="spellStart"/>
-      <w:r>
-        <w:rPr>
-          <w:rFonts w:ascii="Bookman Old Style" w:hAnsi="Bookman Old Style"/>
-          <w:color w:val="000000" w:themeColor="text1"/>
-        </w:rPr>
-        <w:t>reference_id</w:t>
-      </w:r>
-      <w:proofErr w:type="spellEnd"/>
-      <w:r>
-        <w:rPr>
-          <w:rFonts w:ascii="Bookman Old Style" w:hAnsi="Bookman Old Style"/>
-          <w:color w:val="000000" w:themeColor="text1"/>
-        </w:rPr>
-        <w:t>]</w:t>
-      </w:r>
-    </w:p>
-    <w:p>
-      <w:pPr>
-        <w:rPr>
-          <w:rFonts w:ascii="Bookman Old Style" w:hAnsi="Bookman Old Style"/>
-          <w:color w:val="000000" w:themeColor="text1"/>
-        </w:rPr>
-      </w:pPr>
-      <w:r>
-        <w:rPr>
-          <w:rFonts w:ascii="Bookman Old Style" w:hAnsi="Bookman Old Style"/>
-          <w:color w:val="000000" w:themeColor="text1"/>
-        </w:rPr>
+          <w:lang w:val="en-RW"/>
+        </w:rPr>
+        <w:t>": "www.site.com"</w:t>
+      </w:r>
+      <w:r>
+        <w:rPr>
+          <w:rFonts w:ascii="Bookman Old Style" w:hAnsi="Bookman Old Style"/>
+          <w:color w:val="000000" w:themeColor="text1"/>
+          <w:lang w:val="en-RW"/>
+        </w:rPr>
+        <w:br/>
+        <w:t xml:space="preserve">        }</w:t>
+      </w:r>
+      <w:r>
+        <w:rPr>
+          <w:rFonts w:ascii="Bookman Old Style" w:hAnsi="Bookman Old Style"/>
+          <w:color w:val="000000" w:themeColor="text1"/>
+          <w:lang w:val="en-RW"/>
+        </w:rPr>
+        <w:br/>
         <w:t xml:space="preserve">    )</w:t>
       </w:r>
     </w:p>
@@ -7781,301 +7495,805 @@
         <w:rPr>
           <w:rFonts w:ascii="Bookman Old Style" w:hAnsi="Bookman Old Style"/>
           <w:color w:val="000000" w:themeColor="text1"/>
-        </w:rPr>
-      </w:pPr>
-      <w:r>
-        <w:rPr>
-          <w:rFonts w:ascii="Bookman Old Style" w:hAnsi="Bookman Old Style"/>
-          <w:color w:val="000000" w:themeColor="text1"/>
-        </w:rPr>
-        <w:t xml:space="preserve">    </w:t>
-      </w:r>
-    </w:p>
-    <w:p>
-      <w:pPr>
-        <w:rPr>
-          <w:rFonts w:ascii="Bookman Old Style" w:hAnsi="Bookman Old Style"/>
-          <w:color w:val="000000" w:themeColor="text1"/>
-        </w:rPr>
-      </w:pPr>
-      <w:r>
-        <w:rPr>
-          <w:rFonts w:ascii="Bookman Old Style" w:hAnsi="Bookman Old Style"/>
-          <w:color w:val="000000" w:themeColor="text1"/>
-        </w:rPr>
-        <w:t xml:space="preserve">    // Step 4: Log for debugging</w:t>
-      </w:r>
-    </w:p>
-    <w:p>
-      <w:pPr>
-        <w:rPr>
-          <w:rFonts w:ascii="Bookman Old Style" w:hAnsi="Bookman Old Style"/>
-          <w:color w:val="000000" w:themeColor="text1"/>
-        </w:rPr>
-      </w:pPr>
-      <w:r>
-        <w:rPr>
-          <w:rFonts w:ascii="Bookman Old Style" w:hAnsi="Bookman Old Style"/>
-          <w:color w:val="000000" w:themeColor="text1"/>
-        </w:rPr>
-        <w:t xml:space="preserve">    </w:t>
-      </w:r>
-      <w:proofErr w:type="spellStart"/>
-      <w:r>
-        <w:rPr>
-          <w:rFonts w:ascii="Bookman Old Style" w:hAnsi="Bookman Old Style"/>
-          <w:color w:val="000000" w:themeColor="text1"/>
-        </w:rPr>
-        <w:t>write_to_</w:t>
-      </w:r>
-      <w:proofErr w:type="gramStart"/>
-      <w:r>
-        <w:rPr>
-          <w:rFonts w:ascii="Bookman Old Style" w:hAnsi="Bookman Old Style"/>
-          <w:color w:val="000000" w:themeColor="text1"/>
-        </w:rPr>
-        <w:t>log</w:t>
-      </w:r>
-      <w:proofErr w:type="spellEnd"/>
-      <w:r>
-        <w:rPr>
-          <w:rFonts w:ascii="Bookman Old Style" w:hAnsi="Bookman Old Style"/>
-          <w:color w:val="000000" w:themeColor="text1"/>
-        </w:rPr>
-        <w:t>(</w:t>
-      </w:r>
-      <w:proofErr w:type="gramEnd"/>
-      <w:r>
-        <w:rPr>
-          <w:rFonts w:ascii="Bookman Old Style" w:hAnsi="Bookman Old Style"/>
-          <w:color w:val="000000" w:themeColor="text1"/>
-        </w:rPr>
-        <w:t xml:space="preserve">"Callback processed: " + </w:t>
-      </w:r>
-      <w:proofErr w:type="spellStart"/>
-      <w:r>
-        <w:rPr>
-          <w:rFonts w:ascii="Bookman Old Style" w:hAnsi="Bookman Old Style"/>
-          <w:color w:val="000000" w:themeColor="text1"/>
-        </w:rPr>
-        <w:t>reference_id</w:t>
-      </w:r>
-      <w:proofErr w:type="spellEnd"/>
-      <w:r>
-        <w:rPr>
-          <w:rFonts w:ascii="Bookman Old Style" w:hAnsi="Bookman Old Style"/>
-          <w:color w:val="000000" w:themeColor="text1"/>
-        </w:rPr>
-        <w:t xml:space="preserve"> + ", Status: " + status)</w:t>
-      </w:r>
-    </w:p>
-    <w:p>
-      <w:pPr>
-        <w:rPr>
-          <w:rFonts w:ascii="Bookman Old Style" w:hAnsi="Bookman Old Style"/>
-          <w:color w:val="000000" w:themeColor="text1"/>
-        </w:rPr>
-      </w:pPr>
-      <w:r>
-        <w:rPr>
-          <w:rFonts w:ascii="Bookman Old Style" w:hAnsi="Bookman Old Style"/>
-          <w:color w:val="000000" w:themeColor="text1"/>
-        </w:rPr>
-        <w:t xml:space="preserve">    </w:t>
-      </w:r>
-    </w:p>
-    <w:p>
-      <w:pPr>
-        <w:rPr>
-          <w:rFonts w:ascii="Bookman Old Style" w:hAnsi="Bookman Old Style"/>
-          <w:color w:val="000000" w:themeColor="text1"/>
-        </w:rPr>
-      </w:pPr>
-      <w:r>
-        <w:rPr>
-          <w:rFonts w:ascii="Bookman Old Style" w:hAnsi="Bookman Old Style"/>
-          <w:color w:val="000000" w:themeColor="text1"/>
-        </w:rPr>
-        <w:t xml:space="preserve">    // Step 5: Return success acknowledgment</w:t>
-      </w:r>
-    </w:p>
-    <w:p>
-      <w:pPr>
-        <w:rPr>
-          <w:rFonts w:ascii="Bookman Old Style" w:hAnsi="Bookman Old Style"/>
-          <w:color w:val="000000" w:themeColor="text1"/>
-        </w:rPr>
-      </w:pPr>
-      <w:r>
-        <w:rPr>
-          <w:rFonts w:ascii="Bookman Old Style" w:hAnsi="Bookman Old Style"/>
-          <w:color w:val="000000" w:themeColor="text1"/>
-        </w:rPr>
-        <w:t xml:space="preserve">    RETURN </w:t>
-      </w:r>
-      <w:proofErr w:type="spellStart"/>
-      <w:r>
-        <w:rPr>
-          <w:rFonts w:ascii="Bookman Old Style" w:hAnsi="Bookman Old Style"/>
-          <w:color w:val="000000" w:themeColor="text1"/>
-        </w:rPr>
-        <w:t>success_</w:t>
-      </w:r>
-      <w:proofErr w:type="gramStart"/>
-      <w:r>
-        <w:rPr>
-          <w:rFonts w:ascii="Bookman Old Style" w:hAnsi="Bookman Old Style"/>
-          <w:color w:val="000000" w:themeColor="text1"/>
-        </w:rPr>
-        <w:t>response</w:t>
-      </w:r>
-      <w:proofErr w:type="spellEnd"/>
-      <w:r>
-        <w:rPr>
-          <w:rFonts w:ascii="Bookman Old Style" w:hAnsi="Bookman Old Style"/>
-          <w:color w:val="000000" w:themeColor="text1"/>
-        </w:rPr>
-        <w:t>(</w:t>
-      </w:r>
-      <w:proofErr w:type="gramEnd"/>
-      <w:r>
-        <w:rPr>
-          <w:rFonts w:ascii="Bookman Old Style" w:hAnsi="Bookman Old Style"/>
-          <w:color w:val="000000" w:themeColor="text1"/>
-        </w:rPr>
-        <w:t>"Callback processed")</w:t>
-      </w:r>
-    </w:p>
-    <w:p>
-      <w:pPr>
-        <w:rPr>
-          <w:rFonts w:ascii="Bookman Old Style" w:hAnsi="Bookman Old Style"/>
-          <w:b/>
-          <w:bCs/>
-          <w:color w:val="000000" w:themeColor="text1"/>
-        </w:rPr>
-      </w:pPr>
-      <w:r>
-        <w:rPr>
-          <w:rFonts w:ascii="Bookman Old Style" w:hAnsi="Bookman Old Style"/>
-          <w:b/>
-          <w:bCs/>
-          <w:color w:val="000000" w:themeColor="text1"/>
-        </w:rPr>
-        <w:t>Important Notes About Callbacks</w:t>
+          <w:lang w:val="en-RW"/>
+        </w:rPr>
+      </w:pPr>
+      <w:r>
+        <w:rPr>
+          <w:rFonts w:ascii="Bookman Old Style" w:hAnsi="Bookman Old Style"/>
+          <w:color w:val="000000" w:themeColor="text1"/>
+          <w:lang w:val="en-RW"/>
+        </w:rPr>
+        <w:pict w14:anchorId="3439F734">
+          <v:rect id="_x0000_i1065" style="width:0;height:1.5pt" o:hralign="center" o:hrstd="t" o:hr="t" fillcolor="#a0a0a0" stroked="f"/>
+        </w:pict>
+      </w:r>
+    </w:p>
+    <w:p>
+      <w:pPr>
+        <w:rPr>
+          <w:rFonts w:ascii="Bookman Old Style" w:hAnsi="Bookman Old Style"/>
+          <w:b/>
+          <w:bCs/>
+          <w:color w:val="000000" w:themeColor="text1"/>
+          <w:lang w:val="en-RW"/>
+        </w:rPr>
+      </w:pPr>
+      <w:r>
+        <w:rPr>
+          <w:rFonts w:ascii="Bookman Old Style" w:hAnsi="Bookman Old Style"/>
+          <w:b/>
+          <w:bCs/>
+          <w:color w:val="000000" w:themeColor="text1"/>
+          <w:lang w:val="en-RW"/>
+        </w:rPr>
+        <w:t>How the Callback Works</w:t>
+      </w:r>
+    </w:p>
+    <w:p>
+      <w:pPr>
+        <w:rPr>
+          <w:rFonts w:ascii="Bookman Old Style" w:hAnsi="Bookman Old Style"/>
+          <w:b/>
+          <w:bCs/>
+          <w:color w:val="000000" w:themeColor="text1"/>
+          <w:lang w:val="en-RW"/>
+        </w:rPr>
+      </w:pPr>
+      <w:r>
+        <w:rPr>
+          <w:rFonts w:ascii="Bookman Old Style" w:hAnsi="Bookman Old Style"/>
+          <w:b/>
+          <w:bCs/>
+          <w:color w:val="000000" w:themeColor="text1"/>
+          <w:lang w:val="en-RW"/>
+        </w:rPr>
+        <w:t>1️</w:t>
+      </w:r>
+      <w:r>
+        <w:rPr>
+          <w:rFonts w:ascii="Segoe UI Symbol" w:hAnsi="Segoe UI Symbol" w:cs="Segoe UI Symbol"/>
+          <w:b/>
+          <w:bCs/>
+          <w:color w:val="000000" w:themeColor="text1"/>
+          <w:lang w:val="en-RW"/>
+        </w:rPr>
+        <w:t>⃣</w:t>
+      </w:r>
+      <w:r>
+        <w:rPr>
+          <w:rFonts w:ascii="Bookman Old Style" w:hAnsi="Bookman Old Style"/>
+          <w:b/>
+          <w:bCs/>
+          <w:color w:val="000000" w:themeColor="text1"/>
+          <w:lang w:val="en-RW"/>
+        </w:rPr>
+        <w:t xml:space="preserve"> Receives payment notification</w:t>
+      </w:r>
+    </w:p>
+    <w:p>
+      <w:pPr>
+        <w:rPr>
+          <w:rFonts w:ascii="Bookman Old Style" w:hAnsi="Bookman Old Style"/>
+          <w:color w:val="000000" w:themeColor="text1"/>
+          <w:lang w:val="en-RW"/>
+        </w:rPr>
+      </w:pPr>
+      <w:r>
+        <w:rPr>
+          <w:rFonts w:ascii="Bookman Old Style" w:hAnsi="Bookman Old Style"/>
+          <w:color w:val="000000" w:themeColor="text1"/>
+          <w:lang w:val="en-RW"/>
+        </w:rPr>
+        <w:t xml:space="preserve">Your server receives a </w:t>
+      </w:r>
+      <w:r>
+        <w:rPr>
+          <w:rFonts w:ascii="Bookman Old Style" w:hAnsi="Bookman Old Style"/>
+          <w:b/>
+          <w:bCs/>
+          <w:color w:val="000000" w:themeColor="text1"/>
+          <w:lang w:val="en-RW"/>
+        </w:rPr>
+        <w:t>callback request</w:t>
+      </w:r>
+      <w:r>
+        <w:rPr>
+          <w:rFonts w:ascii="Bookman Old Style" w:hAnsi="Bookman Old Style"/>
+          <w:color w:val="000000" w:themeColor="text1"/>
+          <w:lang w:val="en-RW"/>
+        </w:rPr>
+        <w:t xml:space="preserve"> from the payment gateway when a payment is completed or updated.</w:t>
+      </w:r>
+    </w:p>
+    <w:p>
+      <w:pPr>
+        <w:rPr>
+          <w:rFonts w:ascii="Bookman Old Style" w:hAnsi="Bookman Old Style"/>
+          <w:b/>
+          <w:bCs/>
+          <w:color w:val="000000" w:themeColor="text1"/>
+          <w:lang w:val="en-RW"/>
+        </w:rPr>
+      </w:pPr>
+      <w:r>
+        <w:rPr>
+          <w:rFonts w:ascii="Bookman Old Style" w:hAnsi="Bookman Old Style"/>
+          <w:b/>
+          <w:bCs/>
+          <w:color w:val="000000" w:themeColor="text1"/>
+          <w:lang w:val="en-RW"/>
+        </w:rPr>
+        <w:t>2️</w:t>
+      </w:r>
+      <w:r>
+        <w:rPr>
+          <w:rFonts w:ascii="Segoe UI Symbol" w:hAnsi="Segoe UI Symbol" w:cs="Segoe UI Symbol"/>
+          <w:b/>
+          <w:bCs/>
+          <w:color w:val="000000" w:themeColor="text1"/>
+          <w:lang w:val="en-RW"/>
+        </w:rPr>
+        <w:t>⃣</w:t>
+      </w:r>
+      <w:r>
+        <w:rPr>
+          <w:rFonts w:ascii="Bookman Old Style" w:hAnsi="Bookman Old Style"/>
+          <w:b/>
+          <w:bCs/>
+          <w:color w:val="000000" w:themeColor="text1"/>
+          <w:lang w:val="en-RW"/>
+        </w:rPr>
+        <w:t xml:space="preserve"> Reads JSON data</w:t>
+      </w:r>
+    </w:p>
+    <w:p>
+      <w:pPr>
+        <w:rPr>
+          <w:rFonts w:ascii="Bookman Old Style" w:hAnsi="Bookman Old Style"/>
+          <w:color w:val="000000" w:themeColor="text1"/>
+          <w:lang w:val="en-RW"/>
+        </w:rPr>
+      </w:pPr>
+      <w:r>
+        <w:rPr>
+          <w:rFonts w:ascii="Bookman Old Style" w:hAnsi="Bookman Old Style"/>
+          <w:color w:val="000000" w:themeColor="text1"/>
+          <w:lang w:val="en-RW"/>
+        </w:rPr>
+        <w:t xml:space="preserve">The server reads the </w:t>
+      </w:r>
+      <w:r>
+        <w:rPr>
+          <w:rFonts w:ascii="Bookman Old Style" w:hAnsi="Bookman Old Style"/>
+          <w:b/>
+          <w:bCs/>
+          <w:color w:val="000000" w:themeColor="text1"/>
+          <w:lang w:val="en-RW"/>
+        </w:rPr>
+        <w:t>JSON body</w:t>
+      </w:r>
+      <w:r>
+        <w:rPr>
+          <w:rFonts w:ascii="Bookman Old Style" w:hAnsi="Bookman Old Style"/>
+          <w:color w:val="000000" w:themeColor="text1"/>
+          <w:lang w:val="en-RW"/>
+        </w:rPr>
+        <w:t xml:space="preserve"> sent by the gateway.</w:t>
+      </w:r>
+    </w:p>
+    <w:p>
+      <w:pPr>
+        <w:rPr>
+          <w:rFonts w:ascii="Bookman Old Style" w:hAnsi="Bookman Old Style"/>
+          <w:b/>
+          <w:bCs/>
+          <w:color w:val="000000" w:themeColor="text1"/>
+          <w:lang w:val="en-RW"/>
+        </w:rPr>
+      </w:pPr>
+      <w:r>
+        <w:rPr>
+          <w:rFonts w:ascii="Bookman Old Style" w:hAnsi="Bookman Old Style"/>
+          <w:b/>
+          <w:bCs/>
+          <w:color w:val="000000" w:themeColor="text1"/>
+          <w:lang w:val="en-RW"/>
+        </w:rPr>
+        <w:t>3️</w:t>
+      </w:r>
+      <w:r>
+        <w:rPr>
+          <w:rFonts w:ascii="Segoe UI Symbol" w:hAnsi="Segoe UI Symbol" w:cs="Segoe UI Symbol"/>
+          <w:b/>
+          <w:bCs/>
+          <w:color w:val="000000" w:themeColor="text1"/>
+          <w:lang w:val="en-RW"/>
+        </w:rPr>
+        <w:t>⃣</w:t>
+      </w:r>
+      <w:r>
+        <w:rPr>
+          <w:rFonts w:ascii="Bookman Old Style" w:hAnsi="Bookman Old Style"/>
+          <w:b/>
+          <w:bCs/>
+          <w:color w:val="000000" w:themeColor="text1"/>
+          <w:lang w:val="en-RW"/>
+        </w:rPr>
+        <w:t xml:space="preserve"> Checks required fields</w:t>
+      </w:r>
+    </w:p>
+    <w:p>
+      <w:pPr>
+        <w:rPr>
+          <w:rFonts w:ascii="Bookman Old Style" w:hAnsi="Bookman Old Style"/>
+          <w:color w:val="000000" w:themeColor="text1"/>
+          <w:lang w:val="en-RW"/>
+        </w:rPr>
+      </w:pPr>
+      <w:r>
+        <w:rPr>
+          <w:rFonts w:ascii="Bookman Old Style" w:hAnsi="Bookman Old Style"/>
+          <w:color w:val="000000" w:themeColor="text1"/>
+          <w:lang w:val="en-RW"/>
+        </w:rPr>
+        <w:t>The system verifies that the following fields exist:</w:t>
       </w:r>
     </w:p>
     <w:p>
       <w:pPr>
         <w:numPr>
           <w:ilvl w:val="0"/>
-          <w:numId w:val="8"/>
+          <w:numId w:val="17"/>
         </w:numPr>
         <w:rPr>
           <w:rFonts w:ascii="Bookman Old Style" w:hAnsi="Bookman Old Style"/>
           <w:color w:val="000000" w:themeColor="text1"/>
-        </w:rPr>
-      </w:pPr>
-      <w:r>
-        <w:rPr>
-          <w:rFonts w:ascii="Bookman Old Style" w:hAnsi="Bookman Old Style"/>
-          <w:b/>
-          <w:bCs/>
-          <w:color w:val="000000" w:themeColor="text1"/>
-        </w:rPr>
-        <w:t>Callbacks may be sent multiple times</w:t>
-      </w:r>
-      <w:r>
-        <w:rPr>
-          <w:rFonts w:ascii="Bookman Old Style" w:hAnsi="Bookman Old Style"/>
-          <w:color w:val="000000" w:themeColor="text1"/>
-        </w:rPr>
-        <w:t> - Your handler must be idempotent (check if already processed)</w:t>
+          <w:lang w:val="en-RW"/>
+        </w:rPr>
+      </w:pPr>
+      <w:proofErr w:type="spellStart"/>
+      <w:r>
+        <w:rPr>
+          <w:rFonts w:ascii="Bookman Old Style" w:hAnsi="Bookman Old Style"/>
+          <w:b/>
+          <w:bCs/>
+          <w:color w:val="000000" w:themeColor="text1"/>
+          <w:lang w:val="en-RW"/>
+        </w:rPr>
+        <w:t>reference_id</w:t>
+      </w:r>
+      <w:proofErr w:type="spellEnd"/>
+      <w:r>
+        <w:rPr>
+          <w:rFonts w:ascii="Bookman Old Style" w:hAnsi="Bookman Old Style"/>
+          <w:color w:val="000000" w:themeColor="text1"/>
+          <w:lang w:val="en-RW"/>
+        </w:rPr>
+        <w:t xml:space="preserve"> → Your internal order ID</w:t>
       </w:r>
     </w:p>
     <w:p>
       <w:pPr>
         <w:numPr>
           <w:ilvl w:val="0"/>
-          <w:numId w:val="8"/>
+          <w:numId w:val="17"/>
         </w:numPr>
         <w:rPr>
           <w:rFonts w:ascii="Bookman Old Style" w:hAnsi="Bookman Old Style"/>
           <w:color w:val="000000" w:themeColor="text1"/>
-        </w:rPr>
-      </w:pPr>
-      <w:r>
-        <w:rPr>
-          <w:rFonts w:ascii="Bookman Old Style" w:hAnsi="Bookman Old Style"/>
-          <w:b/>
-          <w:bCs/>
-          <w:color w:val="000000" w:themeColor="text1"/>
-        </w:rPr>
-        <w:t>Always validate data</w:t>
-      </w:r>
-      <w:r>
-        <w:rPr>
-          <w:rFonts w:ascii="Bookman Old Style" w:hAnsi="Bookman Old Style"/>
-          <w:color w:val="000000" w:themeColor="text1"/>
-        </w:rPr>
-        <w:t> before updating your database</w:t>
+          <w:lang w:val="en-RW"/>
+        </w:rPr>
+      </w:pPr>
+      <w:proofErr w:type="spellStart"/>
+      <w:r>
+        <w:rPr>
+          <w:rFonts w:ascii="Bookman Old Style" w:hAnsi="Bookman Old Style"/>
+          <w:b/>
+          <w:bCs/>
+          <w:color w:val="000000" w:themeColor="text1"/>
+          <w:lang w:val="en-RW"/>
+        </w:rPr>
+        <w:t>transaction_id</w:t>
+      </w:r>
+      <w:proofErr w:type="spellEnd"/>
+      <w:r>
+        <w:rPr>
+          <w:rFonts w:ascii="Bookman Old Style" w:hAnsi="Bookman Old Style"/>
+          <w:color w:val="000000" w:themeColor="text1"/>
+          <w:lang w:val="en-RW"/>
+        </w:rPr>
+        <w:t xml:space="preserve"> → Payment gateway transaction ID</w:t>
       </w:r>
     </w:p>
     <w:p>
       <w:pPr>
         <w:numPr>
           <w:ilvl w:val="0"/>
-          <w:numId w:val="8"/>
+          <w:numId w:val="17"/>
         </w:numPr>
         <w:rPr>
           <w:rFonts w:ascii="Bookman Old Style" w:hAnsi="Bookman Old Style"/>
           <w:color w:val="000000" w:themeColor="text1"/>
-        </w:rPr>
-      </w:pPr>
-      <w:r>
-        <w:rPr>
-          <w:rFonts w:ascii="Bookman Old Style" w:hAnsi="Bookman Old Style"/>
-          <w:b/>
-          <w:bCs/>
-          <w:color w:val="000000" w:themeColor="text1"/>
-        </w:rPr>
-        <w:t>Return a 200 OK response</w:t>
-      </w:r>
-      <w:r>
-        <w:rPr>
-          <w:rFonts w:ascii="Bookman Old Style" w:hAnsi="Bookman Old Style"/>
-          <w:color w:val="000000" w:themeColor="text1"/>
-        </w:rPr>
-        <w:t> quickly to acknowledge receipt</w:t>
+          <w:lang w:val="en-RW"/>
+        </w:rPr>
+      </w:pPr>
+      <w:r>
+        <w:rPr>
+          <w:rFonts w:ascii="Bookman Old Style" w:hAnsi="Bookman Old Style"/>
+          <w:b/>
+          <w:bCs/>
+          <w:color w:val="000000" w:themeColor="text1"/>
+          <w:lang w:val="en-RW"/>
+        </w:rPr>
+        <w:t>status</w:t>
+      </w:r>
+      <w:r>
+        <w:rPr>
+          <w:rFonts w:ascii="Bookman Old Style" w:hAnsi="Bookman Old Style"/>
+          <w:color w:val="000000" w:themeColor="text1"/>
+          <w:lang w:val="en-RW"/>
+        </w:rPr>
+        <w:t xml:space="preserve"> → Payment result (success, failed, etc.)</w:t>
       </w:r>
     </w:p>
     <w:p>
       <w:pPr>
         <w:numPr>
           <w:ilvl w:val="0"/>
-          <w:numId w:val="8"/>
+          <w:numId w:val="17"/>
         </w:numPr>
         <w:rPr>
           <w:rFonts w:ascii="Bookman Old Style" w:hAnsi="Bookman Old Style"/>
           <w:color w:val="000000" w:themeColor="text1"/>
-        </w:rPr>
-      </w:pPr>
-      <w:r>
-        <w:rPr>
-          <w:rFonts w:ascii="Bookman Old Style" w:hAnsi="Bookman Old Style"/>
-          <w:b/>
-          <w:bCs/>
-          <w:color w:val="000000" w:themeColor="text1"/>
-        </w:rPr>
-        <w:t>Log everything</w:t>
-      </w:r>
-      <w:r>
-        <w:rPr>
-          <w:rFonts w:ascii="Bookman Old Style" w:hAnsi="Bookman Old Style"/>
-          <w:color w:val="000000" w:themeColor="text1"/>
-        </w:rPr>
-        <w:t> for debugging purposes</w:t>
-      </w:r>
+          <w:lang w:val="en-RW"/>
+        </w:rPr>
+      </w:pPr>
+      <w:r>
+        <w:rPr>
+          <w:rFonts w:ascii="Bookman Old Style" w:hAnsi="Bookman Old Style"/>
+          <w:b/>
+          <w:bCs/>
+          <w:color w:val="000000" w:themeColor="text1"/>
+          <w:lang w:val="en-RW"/>
+        </w:rPr>
+        <w:t>action</w:t>
+      </w:r>
+      <w:r>
+        <w:rPr>
+          <w:rFonts w:ascii="Bookman Old Style" w:hAnsi="Bookman Old Style"/>
+          <w:color w:val="000000" w:themeColor="text1"/>
+          <w:lang w:val="en-RW"/>
+        </w:rPr>
+        <w:t xml:space="preserve"> → Type of callback action</w:t>
+      </w:r>
+    </w:p>
+    <w:p>
+      <w:pPr>
+        <w:rPr>
+          <w:rFonts w:ascii="Bookman Old Style" w:hAnsi="Bookman Old Style"/>
+          <w:b/>
+          <w:bCs/>
+          <w:color w:val="000000" w:themeColor="text1"/>
+          <w:lang w:val="en-RW"/>
+        </w:rPr>
+      </w:pPr>
+      <w:r>
+        <w:rPr>
+          <w:rFonts w:ascii="Bookman Old Style" w:hAnsi="Bookman Old Style"/>
+          <w:b/>
+          <w:bCs/>
+          <w:color w:val="000000" w:themeColor="text1"/>
+          <w:lang w:val="en-RW"/>
+        </w:rPr>
+        <w:t>4️</w:t>
+      </w:r>
+      <w:r>
+        <w:rPr>
+          <w:rFonts w:ascii="Segoe UI Symbol" w:hAnsi="Segoe UI Symbol" w:cs="Segoe UI Symbol"/>
+          <w:b/>
+          <w:bCs/>
+          <w:color w:val="000000" w:themeColor="text1"/>
+          <w:lang w:val="en-RW"/>
+        </w:rPr>
+        <w:t>⃣</w:t>
+      </w:r>
+      <w:r>
+        <w:rPr>
+          <w:rFonts w:ascii="Bookman Old Style" w:hAnsi="Bookman Old Style"/>
+          <w:b/>
+          <w:bCs/>
+          <w:color w:val="000000" w:themeColor="text1"/>
+          <w:lang w:val="en-RW"/>
+        </w:rPr>
+        <w:t xml:space="preserve"> Processes the payment</w:t>
+      </w:r>
+    </w:p>
+    <w:p>
+      <w:pPr>
+        <w:rPr>
+          <w:rFonts w:ascii="Bookman Old Style" w:hAnsi="Bookman Old Style"/>
+          <w:color w:val="000000" w:themeColor="text1"/>
+          <w:lang w:val="en-RW"/>
+        </w:rPr>
+      </w:pPr>
+      <w:r>
+        <w:rPr>
+          <w:rFonts w:ascii="Bookman Old Style" w:hAnsi="Bookman Old Style"/>
+          <w:color w:val="000000" w:themeColor="text1"/>
+          <w:lang w:val="en-RW"/>
+        </w:rPr>
+        <w:t>The system processes the callback by calling:</w:t>
+      </w:r>
+    </w:p>
+    <w:p>
+      <w:pPr>
+        <w:rPr>
+          <w:rFonts w:ascii="Bookman Old Style" w:hAnsi="Bookman Old Style"/>
+          <w:color w:val="000000" w:themeColor="text1"/>
+          <w:lang w:val="en-RW"/>
+        </w:rPr>
+      </w:pPr>
+      <w:proofErr w:type="spellStart"/>
+      <w:r>
+        <w:rPr>
+          <w:rFonts w:ascii="Bookman Old Style" w:hAnsi="Bookman Old Style"/>
+          <w:color w:val="000000" w:themeColor="text1"/>
+          <w:lang w:val="en-RW"/>
+        </w:rPr>
+        <w:t>paymentSystem.receiveCallback</w:t>
+      </w:r>
+      <w:proofErr w:type="spellEnd"/>
+      <w:r>
+        <w:rPr>
+          <w:rFonts w:ascii="Bookman Old Style" w:hAnsi="Bookman Old Style"/>
+          <w:color w:val="000000" w:themeColor="text1"/>
+          <w:lang w:val="en-RW"/>
+        </w:rPr>
+        <w:t>(</w:t>
+      </w:r>
+      <w:proofErr w:type="spellStart"/>
+      <w:r>
+        <w:rPr>
+          <w:rFonts w:ascii="Bookman Old Style" w:hAnsi="Bookman Old Style"/>
+          <w:color w:val="000000" w:themeColor="text1"/>
+          <w:lang w:val="en-RW"/>
+        </w:rPr>
+        <w:t>callbackData</w:t>
+      </w:r>
+      <w:proofErr w:type="spellEnd"/>
+      <w:r>
+        <w:rPr>
+          <w:rFonts w:ascii="Bookman Old Style" w:hAnsi="Bookman Old Style"/>
+          <w:color w:val="000000" w:themeColor="text1"/>
+          <w:lang w:val="en-RW"/>
+        </w:rPr>
+        <w:t>)</w:t>
+      </w:r>
+    </w:p>
+    <w:p>
+      <w:pPr>
+        <w:rPr>
+          <w:rFonts w:ascii="Bookman Old Style" w:hAnsi="Bookman Old Style"/>
+          <w:color w:val="000000" w:themeColor="text1"/>
+          <w:lang w:val="en-RW"/>
+        </w:rPr>
+      </w:pPr>
+      <w:r>
+        <w:rPr>
+          <w:rFonts w:ascii="Bookman Old Style" w:hAnsi="Bookman Old Style"/>
+          <w:color w:val="000000" w:themeColor="text1"/>
+          <w:lang w:val="en-RW"/>
+        </w:rPr>
+        <w:t>This usually:</w:t>
+      </w:r>
+    </w:p>
+    <w:p>
+      <w:pPr>
+        <w:numPr>
+          <w:ilvl w:val="0"/>
+          <w:numId w:val="18"/>
+        </w:numPr>
+        <w:rPr>
+          <w:rFonts w:ascii="Bookman Old Style" w:hAnsi="Bookman Old Style"/>
+          <w:color w:val="000000" w:themeColor="text1"/>
+          <w:lang w:val="en-RW"/>
+        </w:rPr>
+      </w:pPr>
+      <w:r>
+        <w:rPr>
+          <w:rFonts w:ascii="Bookman Old Style" w:hAnsi="Bookman Old Style"/>
+          <w:color w:val="000000" w:themeColor="text1"/>
+          <w:lang w:val="en-RW"/>
+        </w:rPr>
+        <w:t xml:space="preserve">Updates the </w:t>
+      </w:r>
+      <w:r>
+        <w:rPr>
+          <w:rFonts w:ascii="Bookman Old Style" w:hAnsi="Bookman Old Style"/>
+          <w:b/>
+          <w:bCs/>
+          <w:color w:val="000000" w:themeColor="text1"/>
+          <w:lang w:val="en-RW"/>
+        </w:rPr>
+        <w:t>order payment status</w:t>
+      </w:r>
+    </w:p>
+    <w:p>
+      <w:pPr>
+        <w:numPr>
+          <w:ilvl w:val="0"/>
+          <w:numId w:val="18"/>
+        </w:numPr>
+        <w:rPr>
+          <w:rFonts w:ascii="Bookman Old Style" w:hAnsi="Bookman Old Style"/>
+          <w:color w:val="000000" w:themeColor="text1"/>
+          <w:lang w:val="en-RW"/>
+        </w:rPr>
+      </w:pPr>
+      <w:r>
+        <w:rPr>
+          <w:rFonts w:ascii="Bookman Old Style" w:hAnsi="Bookman Old Style"/>
+          <w:color w:val="000000" w:themeColor="text1"/>
+          <w:lang w:val="en-RW"/>
+        </w:rPr>
+        <w:t xml:space="preserve">Stores the </w:t>
+      </w:r>
+      <w:r>
+        <w:rPr>
+          <w:rFonts w:ascii="Bookman Old Style" w:hAnsi="Bookman Old Style"/>
+          <w:b/>
+          <w:bCs/>
+          <w:color w:val="000000" w:themeColor="text1"/>
+          <w:lang w:val="en-RW"/>
+        </w:rPr>
+        <w:t>transaction ID</w:t>
+      </w:r>
+    </w:p>
+    <w:p>
+      <w:pPr>
+        <w:numPr>
+          <w:ilvl w:val="0"/>
+          <w:numId w:val="18"/>
+        </w:numPr>
+        <w:rPr>
+          <w:rFonts w:ascii="Bookman Old Style" w:hAnsi="Bookman Old Style"/>
+          <w:color w:val="000000" w:themeColor="text1"/>
+          <w:lang w:val="en-RW"/>
+        </w:rPr>
+      </w:pPr>
+      <w:r>
+        <w:rPr>
+          <w:rFonts w:ascii="Bookman Old Style" w:hAnsi="Bookman Old Style"/>
+          <w:color w:val="000000" w:themeColor="text1"/>
+          <w:lang w:val="en-RW"/>
+        </w:rPr>
+        <w:t>Records the payment in the database</w:t>
+      </w:r>
+    </w:p>
+    <w:p>
+      <w:pPr>
+        <w:rPr>
+          <w:rFonts w:ascii="Bookman Old Style" w:hAnsi="Bookman Old Style"/>
+          <w:b/>
+          <w:bCs/>
+          <w:color w:val="000000" w:themeColor="text1"/>
+          <w:lang w:val="en-RW"/>
+        </w:rPr>
+      </w:pPr>
+      <w:r>
+        <w:rPr>
+          <w:rFonts w:ascii="Bookman Old Style" w:hAnsi="Bookman Old Style"/>
+          <w:b/>
+          <w:bCs/>
+          <w:color w:val="000000" w:themeColor="text1"/>
+          <w:lang w:val="en-RW"/>
+        </w:rPr>
+        <w:t>5️</w:t>
+      </w:r>
+      <w:r>
+        <w:rPr>
+          <w:rFonts w:ascii="Segoe UI Symbol" w:hAnsi="Segoe UI Symbol" w:cs="Segoe UI Symbol"/>
+          <w:b/>
+          <w:bCs/>
+          <w:color w:val="000000" w:themeColor="text1"/>
+          <w:lang w:val="en-RW"/>
+        </w:rPr>
+        <w:t>⃣</w:t>
+      </w:r>
+      <w:r>
+        <w:rPr>
+          <w:rFonts w:ascii="Bookman Old Style" w:hAnsi="Bookman Old Style"/>
+          <w:b/>
+          <w:bCs/>
+          <w:color w:val="000000" w:themeColor="text1"/>
+          <w:lang w:val="en-RW"/>
+        </w:rPr>
+        <w:t xml:space="preserve"> Returns a response</w:t>
+      </w:r>
+    </w:p>
+    <w:p>
+      <w:pPr>
+        <w:rPr>
+          <w:rFonts w:ascii="Bookman Old Style" w:hAnsi="Bookman Old Style"/>
+          <w:color w:val="000000" w:themeColor="text1"/>
+          <w:lang w:val="en-RW"/>
+        </w:rPr>
+      </w:pPr>
+      <w:r>
+        <w:rPr>
+          <w:rFonts w:ascii="Bookman Old Style" w:hAnsi="Bookman Old Style"/>
+          <w:color w:val="000000" w:themeColor="text1"/>
+          <w:lang w:val="en-RW"/>
+        </w:rPr>
+        <w:t>The server returns a response confirming that the callback was handled.</w:t>
+      </w:r>
+    </w:p>
+    <w:p>
+      <w:pPr>
+        <w:rPr>
+          <w:rFonts w:ascii="Bookman Old Style" w:hAnsi="Bookman Old Style"/>
+          <w:color w:val="000000" w:themeColor="text1"/>
+          <w:lang w:val="en-RW"/>
+        </w:rPr>
+      </w:pPr>
+      <w:r>
+        <w:rPr>
+          <w:rFonts w:ascii="Bookman Old Style" w:hAnsi="Bookman Old Style"/>
+          <w:color w:val="000000" w:themeColor="text1"/>
+          <w:lang w:val="en-RW"/>
+        </w:rPr>
+        <w:t>Example response:</w:t>
+      </w:r>
+    </w:p>
+    <w:p>
+      <w:pPr>
+        <w:rPr>
+          <w:rFonts w:ascii="Bookman Old Style" w:hAnsi="Bookman Old Style"/>
+          <w:color w:val="000000" w:themeColor="text1"/>
+          <w:lang w:val="en-RW"/>
+        </w:rPr>
+      </w:pPr>
+      <w:r>
+        <w:rPr>
+          <w:rFonts w:ascii="Bookman Old Style" w:hAnsi="Bookman Old Style"/>
+          <w:color w:val="000000" w:themeColor="text1"/>
+          <w:lang w:val="en-RW"/>
+        </w:rPr>
+        <w:t>{</w:t>
+      </w:r>
+      <w:r>
+        <w:rPr>
+          <w:rFonts w:ascii="Bookman Old Style" w:hAnsi="Bookman Old Style"/>
+          <w:color w:val="000000" w:themeColor="text1"/>
+          <w:lang w:val="en-RW"/>
+        </w:rPr>
+        <w:br/>
+        <w:t xml:space="preserve">  "status": true,</w:t>
+      </w:r>
+      <w:r>
+        <w:rPr>
+          <w:rFonts w:ascii="Bookman Old Style" w:hAnsi="Bookman Old Style"/>
+          <w:color w:val="000000" w:themeColor="text1"/>
+          <w:lang w:val="en-RW"/>
+        </w:rPr>
+        <w:br/>
+        <w:t xml:space="preserve">  "message": "Callback received and processed",</w:t>
+      </w:r>
+      <w:r>
+        <w:rPr>
+          <w:rFonts w:ascii="Bookman Old Style" w:hAnsi="Bookman Old Style"/>
+          <w:color w:val="000000" w:themeColor="text1"/>
+          <w:lang w:val="en-RW"/>
+        </w:rPr>
+        <w:br/>
+      </w:r>
+      <w:r>
+        <w:rPr>
+          <w:rFonts w:ascii="Bookman Old Style" w:hAnsi="Bookman Old Style"/>
+          <w:color w:val="000000" w:themeColor="text1"/>
+          <w:lang w:val="en-RW"/>
+        </w:rPr>
+        <w:lastRenderedPageBreak/>
+        <w:t xml:space="preserve">  "</w:t>
+      </w:r>
+      <w:proofErr w:type="spellStart"/>
+      <w:r>
+        <w:rPr>
+          <w:rFonts w:ascii="Bookman Old Style" w:hAnsi="Bookman Old Style"/>
+          <w:color w:val="000000" w:themeColor="text1"/>
+          <w:lang w:val="en-RW"/>
+        </w:rPr>
+        <w:t>site_url</w:t>
+      </w:r>
+      <w:proofErr w:type="spellEnd"/>
+      <w:r>
+        <w:rPr>
+          <w:rFonts w:ascii="Bookman Old Style" w:hAnsi="Bookman Old Style"/>
+          <w:color w:val="000000" w:themeColor="text1"/>
+          <w:lang w:val="en-RW"/>
+        </w:rPr>
+        <w:t>": "www.site.com"</w:t>
+      </w:r>
+      <w:r>
+        <w:rPr>
+          <w:rFonts w:ascii="Bookman Old Style" w:hAnsi="Bookman Old Style"/>
+          <w:color w:val="000000" w:themeColor="text1"/>
+          <w:lang w:val="en-RW"/>
+        </w:rPr>
+        <w:br/>
+        <w:t>}</w:t>
+      </w:r>
+    </w:p>
+    <w:p>
+      <w:pPr>
+        <w:numPr>
+          <w:ilvl w:val="0"/>
+          <w:numId w:val="19"/>
+        </w:numPr>
+        <w:rPr>
+          <w:rFonts w:ascii="Bookman Old Style" w:hAnsi="Bookman Old Style"/>
+          <w:color w:val="000000" w:themeColor="text1"/>
+          <w:lang w:val="en-RW"/>
+        </w:rPr>
+      </w:pPr>
+      <w:r>
+        <w:rPr>
+          <w:rFonts w:ascii="Bookman Old Style" w:hAnsi="Bookman Old Style"/>
+          <w:b/>
+          <w:bCs/>
+          <w:color w:val="000000" w:themeColor="text1"/>
+          <w:lang w:val="en-RW"/>
+        </w:rPr>
+        <w:t>status: true</w:t>
+      </w:r>
+      <w:r>
+        <w:rPr>
+          <w:rFonts w:ascii="Bookman Old Style" w:hAnsi="Bookman Old Style"/>
+          <w:color w:val="000000" w:themeColor="text1"/>
+          <w:lang w:val="en-RW"/>
+        </w:rPr>
+        <w:t xml:space="preserve"> → Callback processed successfully</w:t>
+      </w:r>
+    </w:p>
+    <w:p>
+      <w:pPr>
+        <w:numPr>
+          <w:ilvl w:val="0"/>
+          <w:numId w:val="19"/>
+        </w:numPr>
+        <w:rPr>
+          <w:rFonts w:ascii="Bookman Old Style" w:hAnsi="Bookman Old Style"/>
+          <w:color w:val="000000" w:themeColor="text1"/>
+          <w:lang w:val="en-RW"/>
+        </w:rPr>
+      </w:pPr>
+      <w:r>
+        <w:rPr>
+          <w:rFonts w:ascii="Bookman Old Style" w:hAnsi="Bookman Old Style"/>
+          <w:b/>
+          <w:bCs/>
+          <w:color w:val="000000" w:themeColor="text1"/>
+          <w:lang w:val="en-RW"/>
+        </w:rPr>
+        <w:t>status: false</w:t>
+      </w:r>
+      <w:r>
+        <w:rPr>
+          <w:rFonts w:ascii="Bookman Old Style" w:hAnsi="Bookman Old Style"/>
+          <w:color w:val="000000" w:themeColor="text1"/>
+          <w:lang w:val="en-RW"/>
+        </w:rPr>
+        <w:t xml:space="preserve"> → Invalid or missing callback data</w:t>
+      </w:r>
+    </w:p>
+    <w:p>
+      <w:pPr>
+        <w:rPr>
+          <w:rFonts w:ascii="Bookman Old Style" w:hAnsi="Bookman Old Style"/>
+          <w:color w:val="000000" w:themeColor="text1"/>
+        </w:rPr>
+      </w:pPr>
     </w:p>
     <w:p>
       <w:pPr>
@@ -8243,7 +8461,6 @@
           <w:bCs/>
           <w:color w:val="000000" w:themeColor="text1"/>
         </w:rPr>
-        <w:lastRenderedPageBreak/>
         <w:t>Step 3: Redirect Customer</w:t>
       </w:r>
     </w:p>
@@ -8349,15 +8566,13 @@
         </w:rPr>
         <w:t xml:space="preserve">Gets authentication from </w:t>
       </w:r>
-      <w:proofErr w:type="spellStart"/>
-      <w:r>
-        <w:rPr>
-          <w:rFonts w:ascii="Bookman Old Style" w:hAnsi="Bookman Old Style"/>
-          <w:color w:val="000000" w:themeColor="text1"/>
-        </w:rPr>
-        <w:t>Pesapal</w:t>
-      </w:r>
-      <w:proofErr w:type="spellEnd"/>
+      <w:r>
+        <w:rPr>
+          <w:rFonts w:ascii="Bookman Old Style" w:hAnsi="Bookman Old Style"/>
+          <w:color w:val="000000" w:themeColor="text1"/>
+        </w:rPr>
+        <w:t>LMB Tech Pay</w:t>
+      </w:r>
     </w:p>
     <w:p>
       <w:pPr>
@@ -8417,7 +8632,14 @@
           <w:rFonts w:ascii="Bookman Old Style" w:hAnsi="Bookman Old Style"/>
           <w:color w:val="000000" w:themeColor="text1"/>
         </w:rPr>
-        <w:t>Pesapal's</w:t>
+        <w:t>LMBTECH</w:t>
+      </w:r>
+      <w:r>
+        <w:rPr>
+          <w:rFonts w:ascii="Bookman Old Style" w:hAnsi="Bookman Old Style"/>
+          <w:color w:val="000000" w:themeColor="text1"/>
+        </w:rPr>
+        <w:t>'s</w:t>
       </w:r>
       <w:proofErr w:type="spellEnd"/>
       <w:r>
@@ -8444,7 +8666,77 @@
           <w:bCs/>
           <w:color w:val="000000" w:themeColor="text1"/>
         </w:rPr>
-        <w:t>Step 6: Redirect Back</w:t>
+        <w:t xml:space="preserve">Step </w:t>
+      </w:r>
+      <w:r>
+        <w:rPr>
+          <w:rFonts w:ascii="Bookman Old Style" w:hAnsi="Bookman Old Style"/>
+          <w:b/>
+          <w:bCs/>
+          <w:color w:val="000000" w:themeColor="text1"/>
+        </w:rPr>
+        <w:t>6</w:t>
+      </w:r>
+      <w:r>
+        <w:rPr>
+          <w:rFonts w:ascii="Bookman Old Style" w:hAnsi="Bookman Old Style"/>
+          <w:b/>
+          <w:bCs/>
+          <w:color w:val="000000" w:themeColor="text1"/>
+        </w:rPr>
+        <w:t>: Your Callback Handler</w:t>
+      </w:r>
+    </w:p>
+    <w:p>
+      <w:pPr>
+        <w:rPr>
+          <w:rFonts w:ascii="Bookman Old Style" w:hAnsi="Bookman Old Style"/>
+          <w:color w:val="000000" w:themeColor="text1"/>
+        </w:rPr>
+      </w:pPr>
+      <w:r>
+        <w:rPr>
+          <w:rFonts w:ascii="Bookman Old Style" w:hAnsi="Bookman Old Style"/>
+          <w:color w:val="000000" w:themeColor="text1"/>
+        </w:rPr>
+        <w:t>Your callback URL receives the form data and updates your database.</w:t>
+      </w:r>
+    </w:p>
+    <w:p>
+      <w:pPr>
+        <w:rPr>
+          <w:rFonts w:ascii="Bookman Old Style" w:hAnsi="Bookman Old Style"/>
+          <w:b/>
+          <w:bCs/>
+          <w:color w:val="000000" w:themeColor="text1"/>
+        </w:rPr>
+      </w:pPr>
+      <w:r>
+        <w:rPr>
+          <w:rFonts w:ascii="Bookman Old Style" w:hAnsi="Bookman Old Style"/>
+          <w:b/>
+          <w:bCs/>
+          <w:color w:val="000000" w:themeColor="text1"/>
+        </w:rPr>
+        <w:t xml:space="preserve">Step </w:t>
+      </w:r>
+      <w:r>
+        <w:rPr>
+          <w:rFonts w:ascii="Bookman Old Style" w:hAnsi="Bookman Old Style"/>
+          <w:b/>
+          <w:bCs/>
+          <w:color w:val="000000" w:themeColor="text1"/>
+        </w:rPr>
+        <w:t>7</w:t>
+      </w:r>
+      <w:r>
+        <w:rPr>
+          <w:rFonts w:ascii="Bookman Old Style" w:hAnsi="Bookman Old Style"/>
+          <w:b/>
+          <w:bCs/>
+          <w:color w:val="000000" w:themeColor="text1"/>
+        </w:rPr>
+        <w:t>: Redirect Back</w:t>
       </w:r>
     </w:p>
     <w:p>
@@ -8467,7 +8759,14 @@
           <w:rFonts w:ascii="Bookman Old Style" w:hAnsi="Bookman Old Style"/>
           <w:color w:val="000000" w:themeColor="text1"/>
         </w:rPr>
-        <w:t>callback_url</w:t>
+        <w:t>site</w:t>
+      </w:r>
+      <w:r>
+        <w:rPr>
+          <w:rFonts w:ascii="Bookman Old Style" w:hAnsi="Bookman Old Style"/>
+          <w:color w:val="000000" w:themeColor="text1"/>
+        </w:rPr>
+        <w:t>_url</w:t>
       </w:r>
       <w:proofErr w:type="spellEnd"/>
       <w:r>
@@ -8475,55 +8774,87 @@
           <w:rFonts w:ascii="Bookman Old Style" w:hAnsi="Bookman Old Style"/>
           <w:color w:val="000000" w:themeColor="text1"/>
         </w:rPr>
-        <w:t> with the transaction details.</w:t>
-      </w:r>
-    </w:p>
-    <w:p>
-      <w:pPr>
-        <w:rPr>
-          <w:rFonts w:ascii="Bookman Old Style" w:hAnsi="Bookman Old Style"/>
-          <w:b/>
-          <w:bCs/>
-          <w:color w:val="000000" w:themeColor="text1"/>
-        </w:rPr>
-      </w:pPr>
-      <w:r>
-        <w:rPr>
-          <w:rFonts w:ascii="Bookman Old Style" w:hAnsi="Bookman Old Style"/>
-          <w:b/>
-          <w:bCs/>
-          <w:color w:val="000000" w:themeColor="text1"/>
-        </w:rPr>
-        <w:t>Step 7: Your Callback Handler</w:t>
-      </w:r>
-    </w:p>
-    <w:p>
-      <w:pPr>
-        <w:rPr>
-          <w:rFonts w:ascii="Bookman Old Style" w:hAnsi="Bookman Old Style"/>
-          <w:color w:val="000000" w:themeColor="text1"/>
-        </w:rPr>
-      </w:pPr>
-      <w:r>
-        <w:rPr>
-          <w:rFonts w:ascii="Bookman Old Style" w:hAnsi="Bookman Old Style"/>
-          <w:color w:val="000000" w:themeColor="text1"/>
-        </w:rPr>
-        <w:t>Your callback URL receives the form data and updates your database.</w:t>
-      </w:r>
-    </w:p>
-    <w:p>
-      <w:pPr>
-        <w:rPr>
-          <w:rFonts w:ascii="Bookman Old Style" w:hAnsi="Bookman Old Style"/>
-          <w:color w:val="000000" w:themeColor="text1"/>
-        </w:rPr>
-      </w:pPr>
-      <w:r>
-        <w:rPr>
-          <w:rFonts w:ascii="Bookman Old Style" w:hAnsi="Bookman Old Style"/>
-          <w:color w:val="000000" w:themeColor="text1"/>
-        </w:rPr>
+        <w:t> </w:t>
+      </w:r>
+      <w:r>
+        <w:rPr>
+          <w:rFonts w:ascii="Bookman Old Style" w:hAnsi="Bookman Old Style"/>
+          <w:color w:val="000000" w:themeColor="text1"/>
+        </w:rPr>
+        <w:t xml:space="preserve">comes from return of callback payment get way send to you which tell where </w:t>
+      </w:r>
+      <w:r>
+        <w:rPr>
+          <w:rFonts w:ascii="Bookman Old Style" w:hAnsi="Bookman Old Style"/>
+          <w:color w:val="000000" w:themeColor="text1"/>
+        </w:rPr>
+        <w:t>to go</w:t>
+      </w:r>
+      <w:r>
+        <w:rPr>
+          <w:rFonts w:ascii="Bookman Old Style" w:hAnsi="Bookman Old Style"/>
+          <w:color w:val="000000" w:themeColor="text1"/>
+        </w:rPr>
+        <w:t xml:space="preserve"> when </w:t>
+      </w:r>
+      <w:proofErr w:type="spellStart"/>
+      <w:r>
+        <w:rPr>
+          <w:rFonts w:ascii="Bookman Old Style" w:hAnsi="Bookman Old Style"/>
+          <w:color w:val="000000" w:themeColor="text1"/>
+        </w:rPr>
+        <w:t>i</w:t>
+      </w:r>
+      <w:proofErr w:type="spellEnd"/>
+      <w:r>
+        <w:rPr>
+          <w:rFonts w:ascii="Bookman Old Style" w:hAnsi="Bookman Old Style"/>
+          <w:color w:val="000000" w:themeColor="text1"/>
+        </w:rPr>
+        <w:t xml:space="preserve"> </w:t>
+      </w:r>
+      <w:r>
+        <w:rPr>
+          <w:rFonts w:ascii="Bookman Old Style" w:hAnsi="Bookman Old Style"/>
+          <w:color w:val="000000" w:themeColor="text1"/>
+        </w:rPr>
+        <w:t>finish to</w:t>
+      </w:r>
+      <w:r>
+        <w:rPr>
+          <w:rFonts w:ascii="Bookman Old Style" w:hAnsi="Bookman Old Style"/>
+          <w:color w:val="000000" w:themeColor="text1"/>
+        </w:rPr>
+        <w:t xml:space="preserve"> </w:t>
+      </w:r>
+      <w:r>
+        <w:rPr>
+          <w:rFonts w:ascii="Bookman Old Style" w:hAnsi="Bookman Old Style"/>
+          <w:color w:val="000000" w:themeColor="text1"/>
+        </w:rPr>
+        <w:t>pay</w:t>
+      </w:r>
+      <w:r>
+        <w:rPr>
+          <w:rFonts w:ascii="Bookman Old Style" w:hAnsi="Bookman Old Style"/>
+          <w:color w:val="000000" w:themeColor="text1"/>
+        </w:rPr>
+        <w:t>.</w:t>
+      </w:r>
+    </w:p>
+    <w:p>
+      <w:pPr>
+        <w:rPr>
+          <w:rFonts w:ascii="Bookman Old Style" w:hAnsi="Bookman Old Style"/>
+          <w:color w:val="000000" w:themeColor="text1"/>
+        </w:rPr>
+      </w:pPr>
+      <w:r>
+        <w:rPr>
+          <w:rFonts w:ascii="Bookman Old Style" w:hAnsi="Bookman Old Style"/>
+          <w:color w:val="000000" w:themeColor="text1"/>
+        </w:rPr>
+        <w:lastRenderedPageBreak/>
         <w:pict w14:anchorId="392EF12E">
           <v:rect id="_x0000_i1032" style="width:0;height:.75pt" o:hralign="center" o:hrstd="t" o:hr="t" fillcolor="#a0a0a0" stroked="f"/>
         </w:pict>
@@ -9102,7 +9433,6 @@
                 <w:rFonts w:ascii="Bookman Old Style" w:hAnsi="Bookman Old Style"/>
                 <w:color w:val="000000" w:themeColor="text1"/>
               </w:rPr>
-              <w:lastRenderedPageBreak/>
               <w:t>404</w:t>
             </w:r>
           </w:p>
@@ -9413,6 +9743,7 @@
           <w:bCs/>
           <w:color w:val="000000" w:themeColor="text1"/>
         </w:rPr>
+        <w:lastRenderedPageBreak/>
         <w:t>Test Credentials</w:t>
       </w:r>
     </w:p>
@@ -9558,7 +9889,6 @@
         <w:rPr>
           <w:color w:val="000000" w:themeColor="text1"/>
         </w:rPr>
-        <w:lastRenderedPageBreak/>
         <w:t>Quick Reference</w:t>
       </w:r>
       <w:bookmarkEnd w:id="7"/>
@@ -10458,21 +10788,6 @@
           <w:rFonts w:ascii="Bookman Old Style" w:hAnsi="Bookman Old Style"/>
           <w:color w:val="000000" w:themeColor="text1"/>
         </w:rPr>
-        <w:t>text</w:t>
-      </w:r>
-    </w:p>
-    <w:p>
-      <w:pPr>
-        <w:rPr>
-          <w:rFonts w:ascii="Bookman Old Style" w:hAnsi="Bookman Old Style"/>
-          <w:color w:val="000000" w:themeColor="text1"/>
-        </w:rPr>
-      </w:pPr>
-      <w:r>
-        <w:rPr>
-          <w:rFonts w:ascii="Bookman Old Style" w:hAnsi="Bookman Old Style"/>
-          <w:color w:val="000000" w:themeColor="text1"/>
-        </w:rPr>
         <w:t>Format: [PREFIX]-[DATE]-[RANDOM]</w:t>
       </w:r>
     </w:p>
@@ -10488,6 +10803,7 @@
           <w:rFonts w:ascii="Bookman Old Style" w:hAnsi="Bookman Old Style"/>
           <w:color w:val="000000" w:themeColor="text1"/>
         </w:rPr>
+        <w:lastRenderedPageBreak/>
         <w:t>Example: ORDER-20260215-1234</w:t>
       </w:r>
     </w:p>
@@ -10648,7 +10964,6 @@
           <w:bCs/>
           <w:color w:val="000000" w:themeColor="text1"/>
         </w:rPr>
-        <w:lastRenderedPageBreak/>
         <w:t>Support Email:</w:t>
       </w:r>
       <w:r>
@@ -10793,6 +11108,155 @@
     </w:lvl>
   </w:abstractNum>
   <w:abstractNum w:abstractNumId="1" w15:restartNumberingAfterBreak="0">
+    <w:nsid w:val="17FE2678"/>
+    <w:multiLevelType w:val="multilevel"/>
+    <w:tmpl w:val="E9783A4E"/>
+    <w:lvl w:ilvl="0">
+      <w:start w:val="1"/>
+      <w:numFmt w:val="bullet"/>
+      <w:lvlText w:val=""/>
+      <w:lvlJc w:val="left"/>
+      <w:pPr>
+        <w:tabs>
+          <w:tab w:val="num" w:pos="720"/>
+        </w:tabs>
+        <w:ind w:left="720" w:hanging="360"/>
+      </w:pPr>
+      <w:rPr>
+        <w:rFonts w:ascii="Symbol" w:hAnsi="Symbol" w:hint="default"/>
+        <w:sz w:val="20"/>
+      </w:rPr>
+    </w:lvl>
+    <w:lvl w:ilvl="1" w:tentative="1">
+      <w:start w:val="1"/>
+      <w:numFmt w:val="bullet"/>
+      <w:lvlText w:val="o"/>
+      <w:lvlJc w:val="left"/>
+      <w:pPr>
+        <w:tabs>
+          <w:tab w:val="num" w:pos="1440"/>
+        </w:tabs>
+        <w:ind w:left="1440" w:hanging="360"/>
+      </w:pPr>
+      <w:rPr>
+        <w:rFonts w:ascii="Courier New" w:hAnsi="Courier New" w:hint="default"/>
+        <w:sz w:val="20"/>
+      </w:rPr>
+    </w:lvl>
+    <w:lvl w:ilvl="2" w:tentative="1">
+      <w:start w:val="1"/>
+      <w:numFmt w:val="bullet"/>
+      <w:lvlText w:val=""/>
+      <w:lvlJc w:val="left"/>
+      <w:pPr>
+        <w:tabs>
+          <w:tab w:val="num" w:pos="2160"/>
+        </w:tabs>
+        <w:ind w:left="2160" w:hanging="360"/>
+      </w:pPr>
+      <w:rPr>
+        <w:rFonts w:ascii="Wingdings" w:hAnsi="Wingdings" w:hint="default"/>
+        <w:sz w:val="20"/>
+      </w:rPr>
+    </w:lvl>
+    <w:lvl w:ilvl="3" w:tentative="1">
+      <w:start w:val="1"/>
+      <w:numFmt w:val="bullet"/>
+      <w:lvlText w:val=""/>
+      <w:lvlJc w:val="left"/>
+      <w:pPr>
+        <w:tabs>
+          <w:tab w:val="num" w:pos="2880"/>
+        </w:tabs>
+        <w:ind w:left="2880" w:hanging="360"/>
+      </w:pPr>
+      <w:rPr>
+        <w:rFonts w:ascii="Wingdings" w:hAnsi="Wingdings" w:hint="default"/>
+        <w:sz w:val="20"/>
+      </w:rPr>
+    </w:lvl>
+    <w:lvl w:ilvl="4" w:tentative="1">
+      <w:start w:val="1"/>
+      <w:numFmt w:val="bullet"/>
+      <w:lvlText w:val=""/>
+      <w:lvlJc w:val="left"/>
+      <w:pPr>
+        <w:tabs>
+          <w:tab w:val="num" w:pos="3600"/>
+        </w:tabs>
+        <w:ind w:left="3600" w:hanging="360"/>
+      </w:pPr>
+      <w:rPr>
+        <w:rFonts w:ascii="Wingdings" w:hAnsi="Wingdings" w:hint="default"/>
+        <w:sz w:val="20"/>
+      </w:rPr>
+    </w:lvl>
+    <w:lvl w:ilvl="5" w:tentative="1">
+      <w:start w:val="1"/>
+      <w:numFmt w:val="bullet"/>
+      <w:lvlText w:val=""/>
+      <w:lvlJc w:val="left"/>
+      <w:pPr>
+        <w:tabs>
+          <w:tab w:val="num" w:pos="4320"/>
+        </w:tabs>
+        <w:ind w:left="4320" w:hanging="360"/>
+      </w:pPr>
+      <w:rPr>
+        <w:rFonts w:ascii="Wingdings" w:hAnsi="Wingdings" w:hint="default"/>
+        <w:sz w:val="20"/>
+      </w:rPr>
+    </w:lvl>
+    <w:lvl w:ilvl="6" w:tentative="1">
+      <w:start w:val="1"/>
+      <w:numFmt w:val="bullet"/>
+      <w:lvlText w:val=""/>
+      <w:lvlJc w:val="left"/>
+      <w:pPr>
+        <w:tabs>
+          <w:tab w:val="num" w:pos="5040"/>
+        </w:tabs>
+        <w:ind w:left="5040" w:hanging="360"/>
+      </w:pPr>
+      <w:rPr>
+        <w:rFonts w:ascii="Wingdings" w:hAnsi="Wingdings" w:hint="default"/>
+        <w:sz w:val="20"/>
+      </w:rPr>
+    </w:lvl>
+    <w:lvl w:ilvl="7" w:tentative="1">
+      <w:start w:val="1"/>
+      <w:numFmt w:val="bullet"/>
+      <w:lvlText w:val=""/>
+      <w:lvlJc w:val="left"/>
+      <w:pPr>
+        <w:tabs>
+          <w:tab w:val="num" w:pos="5760"/>
+        </w:tabs>
+        <w:ind w:left="5760" w:hanging="360"/>
+      </w:pPr>
+      <w:rPr>
+        <w:rFonts w:ascii="Wingdings" w:hAnsi="Wingdings" w:hint="default"/>
+        <w:sz w:val="20"/>
+      </w:rPr>
+    </w:lvl>
+    <w:lvl w:ilvl="8" w:tentative="1">
+      <w:start w:val="1"/>
+      <w:numFmt w:val="bullet"/>
+      <w:lvlText w:val=""/>
+      <w:lvlJc w:val="left"/>
+      <w:pPr>
+        <w:tabs>
+          <w:tab w:val="num" w:pos="6480"/>
+        </w:tabs>
+        <w:ind w:left="6480" w:hanging="360"/>
+      </w:pPr>
+      <w:rPr>
+        <w:rFonts w:ascii="Wingdings" w:hAnsi="Wingdings" w:hint="default"/>
+        <w:sz w:val="20"/>
+      </w:rPr>
+    </w:lvl>
+  </w:abstractNum>
+  <w:abstractNum w:abstractNumId="2" w15:restartNumberingAfterBreak="0">
     <w:nsid w:val="1D4213DE"/>
     <w:multiLevelType w:val="multilevel"/>
     <w:tmpl w:val="E50A3EEA"/>
@@ -10941,7 +11405,7 @@
       </w:rPr>
     </w:lvl>
   </w:abstractNum>
-  <w:abstractNum w:abstractNumId="2" w15:restartNumberingAfterBreak="0">
+  <w:abstractNum w:abstractNumId="3" w15:restartNumberingAfterBreak="0">
     <w:nsid w:val="1E58594B"/>
     <w:multiLevelType w:val="multilevel"/>
     <w:tmpl w:val="91D03D60"/>
@@ -11090,7 +11554,7 @@
       </w:rPr>
     </w:lvl>
   </w:abstractNum>
-  <w:abstractNum w:abstractNumId="3" w15:restartNumberingAfterBreak="0">
+  <w:abstractNum w:abstractNumId="4" w15:restartNumberingAfterBreak="0">
     <w:nsid w:val="26460C08"/>
     <w:multiLevelType w:val="multilevel"/>
     <w:tmpl w:val="A3B002C4"/>
@@ -11239,7 +11703,7 @@
       </w:rPr>
     </w:lvl>
   </w:abstractNum>
-  <w:abstractNum w:abstractNumId="4" w15:restartNumberingAfterBreak="0">
+  <w:abstractNum w:abstractNumId="5" w15:restartNumberingAfterBreak="0">
     <w:nsid w:val="315B1AD6"/>
     <w:multiLevelType w:val="multilevel"/>
     <w:tmpl w:val="8F9AB2DA"/>
@@ -11352,7 +11816,7 @@
       </w:pPr>
     </w:lvl>
   </w:abstractNum>
-  <w:abstractNum w:abstractNumId="5" w15:restartNumberingAfterBreak="0">
+  <w:abstractNum w:abstractNumId="6" w15:restartNumberingAfterBreak="0">
     <w:nsid w:val="413C5ECC"/>
     <w:multiLevelType w:val="multilevel"/>
     <w:tmpl w:val="F6BC1C12"/>
@@ -11501,7 +11965,7 @@
       </w:rPr>
     </w:lvl>
   </w:abstractNum>
-  <w:abstractNum w:abstractNumId="6" w15:restartNumberingAfterBreak="0">
+  <w:abstractNum w:abstractNumId="7" w15:restartNumberingAfterBreak="0">
     <w:nsid w:val="416B6B9B"/>
     <w:multiLevelType w:val="multilevel"/>
     <w:tmpl w:val="D5BAF9D4"/>
@@ -11614,7 +12078,156 @@
       </w:pPr>
     </w:lvl>
   </w:abstractNum>
-  <w:abstractNum w:abstractNumId="7" w15:restartNumberingAfterBreak="0">
+  <w:abstractNum w:abstractNumId="8" w15:restartNumberingAfterBreak="0">
+    <w:nsid w:val="48ED7B6C"/>
+    <w:multiLevelType w:val="multilevel"/>
+    <w:tmpl w:val="8340A4B4"/>
+    <w:lvl w:ilvl="0">
+      <w:start w:val="1"/>
+      <w:numFmt w:val="bullet"/>
+      <w:lvlText w:val=""/>
+      <w:lvlJc w:val="left"/>
+      <w:pPr>
+        <w:tabs>
+          <w:tab w:val="num" w:pos="720"/>
+        </w:tabs>
+        <w:ind w:left="720" w:hanging="360"/>
+      </w:pPr>
+      <w:rPr>
+        <w:rFonts w:ascii="Symbol" w:hAnsi="Symbol" w:hint="default"/>
+        <w:sz w:val="20"/>
+      </w:rPr>
+    </w:lvl>
+    <w:lvl w:ilvl="1" w:tentative="1">
+      <w:start w:val="1"/>
+      <w:numFmt w:val="bullet"/>
+      <w:lvlText w:val="o"/>
+      <w:lvlJc w:val="left"/>
+      <w:pPr>
+        <w:tabs>
+          <w:tab w:val="num" w:pos="1440"/>
+        </w:tabs>
+        <w:ind w:left="1440" w:hanging="360"/>
+      </w:pPr>
+      <w:rPr>
+        <w:rFonts w:ascii="Courier New" w:hAnsi="Courier New" w:hint="default"/>
+        <w:sz w:val="20"/>
+      </w:rPr>
+    </w:lvl>
+    <w:lvl w:ilvl="2" w:tentative="1">
+      <w:start w:val="1"/>
+      <w:numFmt w:val="bullet"/>
+      <w:lvlText w:val=""/>
+      <w:lvlJc w:val="left"/>
+      <w:pPr>
+        <w:tabs>
+          <w:tab w:val="num" w:pos="2160"/>
+        </w:tabs>
+        <w:ind w:left="2160" w:hanging="360"/>
+      </w:pPr>
+      <w:rPr>
+        <w:rFonts w:ascii="Wingdings" w:hAnsi="Wingdings" w:hint="default"/>
+        <w:sz w:val="20"/>
+      </w:rPr>
+    </w:lvl>
+    <w:lvl w:ilvl="3" w:tentative="1">
+      <w:start w:val="1"/>
+      <w:numFmt w:val="bullet"/>
+      <w:lvlText w:val=""/>
+      <w:lvlJc w:val="left"/>
+      <w:pPr>
+        <w:tabs>
+          <w:tab w:val="num" w:pos="2880"/>
+        </w:tabs>
+        <w:ind w:left="2880" w:hanging="360"/>
+      </w:pPr>
+      <w:rPr>
+        <w:rFonts w:ascii="Wingdings" w:hAnsi="Wingdings" w:hint="default"/>
+        <w:sz w:val="20"/>
+      </w:rPr>
+    </w:lvl>
+    <w:lvl w:ilvl="4" w:tentative="1">
+      <w:start w:val="1"/>
+      <w:numFmt w:val="bullet"/>
+      <w:lvlText w:val=""/>
+      <w:lvlJc w:val="left"/>
+      <w:pPr>
+        <w:tabs>
+          <w:tab w:val="num" w:pos="3600"/>
+        </w:tabs>
+        <w:ind w:left="3600" w:hanging="360"/>
+      </w:pPr>
+      <w:rPr>
+        <w:rFonts w:ascii="Wingdings" w:hAnsi="Wingdings" w:hint="default"/>
+        <w:sz w:val="20"/>
+      </w:rPr>
+    </w:lvl>
+    <w:lvl w:ilvl="5" w:tentative="1">
+      <w:start w:val="1"/>
+      <w:numFmt w:val="bullet"/>
+      <w:lvlText w:val=""/>
+      <w:lvlJc w:val="left"/>
+      <w:pPr>
+        <w:tabs>
+          <w:tab w:val="num" w:pos="4320"/>
+        </w:tabs>
+        <w:ind w:left="4320" w:hanging="360"/>
+      </w:pPr>
+      <w:rPr>
+        <w:rFonts w:ascii="Wingdings" w:hAnsi="Wingdings" w:hint="default"/>
+        <w:sz w:val="20"/>
+      </w:rPr>
+    </w:lvl>
+    <w:lvl w:ilvl="6" w:tentative="1">
+      <w:start w:val="1"/>
+      <w:numFmt w:val="bullet"/>
+      <w:lvlText w:val=""/>
+      <w:lvlJc w:val="left"/>
+      <w:pPr>
+        <w:tabs>
+          <w:tab w:val="num" w:pos="5040"/>
+        </w:tabs>
+        <w:ind w:left="5040" w:hanging="360"/>
+      </w:pPr>
+      <w:rPr>
+        <w:rFonts w:ascii="Wingdings" w:hAnsi="Wingdings" w:hint="default"/>
+        <w:sz w:val="20"/>
+      </w:rPr>
+    </w:lvl>
+    <w:lvl w:ilvl="7" w:tentative="1">
+      <w:start w:val="1"/>
+      <w:numFmt w:val="bullet"/>
+      <w:lvlText w:val=""/>
+      <w:lvlJc w:val="left"/>
+      <w:pPr>
+        <w:tabs>
+          <w:tab w:val="num" w:pos="5760"/>
+        </w:tabs>
+        <w:ind w:left="5760" w:hanging="360"/>
+      </w:pPr>
+      <w:rPr>
+        <w:rFonts w:ascii="Wingdings" w:hAnsi="Wingdings" w:hint="default"/>
+        <w:sz w:val="20"/>
+      </w:rPr>
+    </w:lvl>
+    <w:lvl w:ilvl="8" w:tentative="1">
+      <w:start w:val="1"/>
+      <w:numFmt w:val="bullet"/>
+      <w:lvlText w:val=""/>
+      <w:lvlJc w:val="left"/>
+      <w:pPr>
+        <w:tabs>
+          <w:tab w:val="num" w:pos="6480"/>
+        </w:tabs>
+        <w:ind w:left="6480" w:hanging="360"/>
+      </w:pPr>
+      <w:rPr>
+        <w:rFonts w:ascii="Wingdings" w:hAnsi="Wingdings" w:hint="default"/>
+        <w:sz w:val="20"/>
+      </w:rPr>
+    </w:lvl>
+  </w:abstractNum>
+  <w:abstractNum w:abstractNumId="9" w15:restartNumberingAfterBreak="0">
     <w:nsid w:val="4F6D5136"/>
     <w:multiLevelType w:val="multilevel"/>
     <w:tmpl w:val="AC84E540"/>
@@ -11727,7 +12340,156 @@
       </w:pPr>
     </w:lvl>
   </w:abstractNum>
-  <w:abstractNum w:abstractNumId="8" w15:restartNumberingAfterBreak="0">
+  <w:abstractNum w:abstractNumId="10" w15:restartNumberingAfterBreak="0">
+    <w:nsid w:val="55FA3134"/>
+    <w:multiLevelType w:val="multilevel"/>
+    <w:tmpl w:val="B7D84B26"/>
+    <w:lvl w:ilvl="0">
+      <w:start w:val="1"/>
+      <w:numFmt w:val="bullet"/>
+      <w:lvlText w:val=""/>
+      <w:lvlJc w:val="left"/>
+      <w:pPr>
+        <w:tabs>
+          <w:tab w:val="num" w:pos="720"/>
+        </w:tabs>
+        <w:ind w:left="720" w:hanging="360"/>
+      </w:pPr>
+      <w:rPr>
+        <w:rFonts w:ascii="Symbol" w:hAnsi="Symbol" w:hint="default"/>
+        <w:sz w:val="20"/>
+      </w:rPr>
+    </w:lvl>
+    <w:lvl w:ilvl="1" w:tentative="1">
+      <w:start w:val="1"/>
+      <w:numFmt w:val="bullet"/>
+      <w:lvlText w:val="o"/>
+      <w:lvlJc w:val="left"/>
+      <w:pPr>
+        <w:tabs>
+          <w:tab w:val="num" w:pos="1440"/>
+        </w:tabs>
+        <w:ind w:left="1440" w:hanging="360"/>
+      </w:pPr>
+      <w:rPr>
+        <w:rFonts w:ascii="Courier New" w:hAnsi="Courier New" w:hint="default"/>
+        <w:sz w:val="20"/>
+      </w:rPr>
+    </w:lvl>
+    <w:lvl w:ilvl="2" w:tentative="1">
+      <w:start w:val="1"/>
+      <w:numFmt w:val="bullet"/>
+      <w:lvlText w:val=""/>
+      <w:lvlJc w:val="left"/>
+      <w:pPr>
+        <w:tabs>
+          <w:tab w:val="num" w:pos="2160"/>
+        </w:tabs>
+        <w:ind w:left="2160" w:hanging="360"/>
+      </w:pPr>
+      <w:rPr>
+        <w:rFonts w:ascii="Wingdings" w:hAnsi="Wingdings" w:hint="default"/>
+        <w:sz w:val="20"/>
+      </w:rPr>
+    </w:lvl>
+    <w:lvl w:ilvl="3" w:tentative="1">
+      <w:start w:val="1"/>
+      <w:numFmt w:val="bullet"/>
+      <w:lvlText w:val=""/>
+      <w:lvlJc w:val="left"/>
+      <w:pPr>
+        <w:tabs>
+          <w:tab w:val="num" w:pos="2880"/>
+        </w:tabs>
+        <w:ind w:left="2880" w:hanging="360"/>
+      </w:pPr>
+      <w:rPr>
+        <w:rFonts w:ascii="Wingdings" w:hAnsi="Wingdings" w:hint="default"/>
+        <w:sz w:val="20"/>
+      </w:rPr>
+    </w:lvl>
+    <w:lvl w:ilvl="4" w:tentative="1">
+      <w:start w:val="1"/>
+      <w:numFmt w:val="bullet"/>
+      <w:lvlText w:val=""/>
+      <w:lvlJc w:val="left"/>
+      <w:pPr>
+        <w:tabs>
+          <w:tab w:val="num" w:pos="3600"/>
+        </w:tabs>
+        <w:ind w:left="3600" w:hanging="360"/>
+      </w:pPr>
+      <w:rPr>
+        <w:rFonts w:ascii="Wingdings" w:hAnsi="Wingdings" w:hint="default"/>
+        <w:sz w:val="20"/>
+      </w:rPr>
+    </w:lvl>
+    <w:lvl w:ilvl="5" w:tentative="1">
+      <w:start w:val="1"/>
+      <w:numFmt w:val="bullet"/>
+      <w:lvlText w:val=""/>
+      <w:lvlJc w:val="left"/>
+      <w:pPr>
+        <w:tabs>
+          <w:tab w:val="num" w:pos="4320"/>
+        </w:tabs>
+        <w:ind w:left="4320" w:hanging="360"/>
+      </w:pPr>
+      <w:rPr>
+        <w:rFonts w:ascii="Wingdings" w:hAnsi="Wingdings" w:hint="default"/>
+        <w:sz w:val="20"/>
+      </w:rPr>
+    </w:lvl>
+    <w:lvl w:ilvl="6" w:tentative="1">
+      <w:start w:val="1"/>
+      <w:numFmt w:val="bullet"/>
+      <w:lvlText w:val=""/>
+      <w:lvlJc w:val="left"/>
+      <w:pPr>
+        <w:tabs>
+          <w:tab w:val="num" w:pos="5040"/>
+        </w:tabs>
+        <w:ind w:left="5040" w:hanging="360"/>
+      </w:pPr>
+      <w:rPr>
+        <w:rFonts w:ascii="Wingdings" w:hAnsi="Wingdings" w:hint="default"/>
+        <w:sz w:val="20"/>
+      </w:rPr>
+    </w:lvl>
+    <w:lvl w:ilvl="7" w:tentative="1">
+      <w:start w:val="1"/>
+      <w:numFmt w:val="bullet"/>
+      <w:lvlText w:val=""/>
+      <w:lvlJc w:val="left"/>
+      <w:pPr>
+        <w:tabs>
+          <w:tab w:val="num" w:pos="5760"/>
+        </w:tabs>
+        <w:ind w:left="5760" w:hanging="360"/>
+      </w:pPr>
+      <w:rPr>
+        <w:rFonts w:ascii="Wingdings" w:hAnsi="Wingdings" w:hint="default"/>
+        <w:sz w:val="20"/>
+      </w:rPr>
+    </w:lvl>
+    <w:lvl w:ilvl="8" w:tentative="1">
+      <w:start w:val="1"/>
+      <w:numFmt w:val="bullet"/>
+      <w:lvlText w:val=""/>
+      <w:lvlJc w:val="left"/>
+      <w:pPr>
+        <w:tabs>
+          <w:tab w:val="num" w:pos="6480"/>
+        </w:tabs>
+        <w:ind w:left="6480" w:hanging="360"/>
+      </w:pPr>
+      <w:rPr>
+        <w:rFonts w:ascii="Wingdings" w:hAnsi="Wingdings" w:hint="default"/>
+        <w:sz w:val="20"/>
+      </w:rPr>
+    </w:lvl>
+  </w:abstractNum>
+  <w:abstractNum w:abstractNumId="11" w15:restartNumberingAfterBreak="0">
     <w:nsid w:val="586551B7"/>
     <w:multiLevelType w:val="multilevel"/>
     <w:tmpl w:val="661CB55C"/>
@@ -11876,7 +12638,156 @@
       </w:rPr>
     </w:lvl>
   </w:abstractNum>
-  <w:abstractNum w:abstractNumId="9" w15:restartNumberingAfterBreak="0">
+  <w:abstractNum w:abstractNumId="12" w15:restartNumberingAfterBreak="0">
+    <w:nsid w:val="5E094970"/>
+    <w:multiLevelType w:val="multilevel"/>
+    <w:tmpl w:val="04BAA6C6"/>
+    <w:lvl w:ilvl="0">
+      <w:start w:val="1"/>
+      <w:numFmt w:val="bullet"/>
+      <w:lvlText w:val=""/>
+      <w:lvlJc w:val="left"/>
+      <w:pPr>
+        <w:tabs>
+          <w:tab w:val="num" w:pos="720"/>
+        </w:tabs>
+        <w:ind w:left="720" w:hanging="360"/>
+      </w:pPr>
+      <w:rPr>
+        <w:rFonts w:ascii="Symbol" w:hAnsi="Symbol" w:hint="default"/>
+        <w:sz w:val="20"/>
+      </w:rPr>
+    </w:lvl>
+    <w:lvl w:ilvl="1" w:tentative="1">
+      <w:start w:val="1"/>
+      <w:numFmt w:val="bullet"/>
+      <w:lvlText w:val="o"/>
+      <w:lvlJc w:val="left"/>
+      <w:pPr>
+        <w:tabs>
+          <w:tab w:val="num" w:pos="1440"/>
+        </w:tabs>
+        <w:ind w:left="1440" w:hanging="360"/>
+      </w:pPr>
+      <w:rPr>
+        <w:rFonts w:ascii="Courier New" w:hAnsi="Courier New" w:hint="default"/>
+        <w:sz w:val="20"/>
+      </w:rPr>
+    </w:lvl>
+    <w:lvl w:ilvl="2" w:tentative="1">
+      <w:start w:val="1"/>
+      <w:numFmt w:val="bullet"/>
+      <w:lvlText w:val=""/>
+      <w:lvlJc w:val="left"/>
+      <w:pPr>
+        <w:tabs>
+          <w:tab w:val="num" w:pos="2160"/>
+        </w:tabs>
+        <w:ind w:left="2160" w:hanging="360"/>
+      </w:pPr>
+      <w:rPr>
+        <w:rFonts w:ascii="Wingdings" w:hAnsi="Wingdings" w:hint="default"/>
+        <w:sz w:val="20"/>
+      </w:rPr>
+    </w:lvl>
+    <w:lvl w:ilvl="3" w:tentative="1">
+      <w:start w:val="1"/>
+      <w:numFmt w:val="bullet"/>
+      <w:lvlText w:val=""/>
+      <w:lvlJc w:val="left"/>
+      <w:pPr>
+        <w:tabs>
+          <w:tab w:val="num" w:pos="2880"/>
+        </w:tabs>
+        <w:ind w:left="2880" w:hanging="360"/>
+      </w:pPr>
+      <w:rPr>
+        <w:rFonts w:ascii="Wingdings" w:hAnsi="Wingdings" w:hint="default"/>
+        <w:sz w:val="20"/>
+      </w:rPr>
+    </w:lvl>
+    <w:lvl w:ilvl="4" w:tentative="1">
+      <w:start w:val="1"/>
+      <w:numFmt w:val="bullet"/>
+      <w:lvlText w:val=""/>
+      <w:lvlJc w:val="left"/>
+      <w:pPr>
+        <w:tabs>
+          <w:tab w:val="num" w:pos="3600"/>
+        </w:tabs>
+        <w:ind w:left="3600" w:hanging="360"/>
+      </w:pPr>
+      <w:rPr>
+        <w:rFonts w:ascii="Wingdings" w:hAnsi="Wingdings" w:hint="default"/>
+        <w:sz w:val="20"/>
+      </w:rPr>
+    </w:lvl>
+    <w:lvl w:ilvl="5" w:tentative="1">
+      <w:start w:val="1"/>
+      <w:numFmt w:val="bullet"/>
+      <w:lvlText w:val=""/>
+      <w:lvlJc w:val="left"/>
+      <w:pPr>
+        <w:tabs>
+          <w:tab w:val="num" w:pos="4320"/>
+        </w:tabs>
+        <w:ind w:left="4320" w:hanging="360"/>
+      </w:pPr>
+      <w:rPr>
+        <w:rFonts w:ascii="Wingdings" w:hAnsi="Wingdings" w:hint="default"/>
+        <w:sz w:val="20"/>
+      </w:rPr>
+    </w:lvl>
+    <w:lvl w:ilvl="6" w:tentative="1">
+      <w:start w:val="1"/>
+      <w:numFmt w:val="bullet"/>
+      <w:lvlText w:val=""/>
+      <w:lvlJc w:val="left"/>
+      <w:pPr>
+        <w:tabs>
+          <w:tab w:val="num" w:pos="5040"/>
+        </w:tabs>
+        <w:ind w:left="5040" w:hanging="360"/>
+      </w:pPr>
+      <w:rPr>
+        <w:rFonts w:ascii="Wingdings" w:hAnsi="Wingdings" w:hint="default"/>
+        <w:sz w:val="20"/>
+      </w:rPr>
+    </w:lvl>
+    <w:lvl w:ilvl="7" w:tentative="1">
+      <w:start w:val="1"/>
+      <w:numFmt w:val="bullet"/>
+      <w:lvlText w:val=""/>
+      <w:lvlJc w:val="left"/>
+      <w:pPr>
+        <w:tabs>
+          <w:tab w:val="num" w:pos="5760"/>
+        </w:tabs>
+        <w:ind w:left="5760" w:hanging="360"/>
+      </w:pPr>
+      <w:rPr>
+        <w:rFonts w:ascii="Wingdings" w:hAnsi="Wingdings" w:hint="default"/>
+        <w:sz w:val="20"/>
+      </w:rPr>
+    </w:lvl>
+    <w:lvl w:ilvl="8" w:tentative="1">
+      <w:start w:val="1"/>
+      <w:numFmt w:val="bullet"/>
+      <w:lvlText w:val=""/>
+      <w:lvlJc w:val="left"/>
+      <w:pPr>
+        <w:tabs>
+          <w:tab w:val="num" w:pos="6480"/>
+        </w:tabs>
+        <w:ind w:left="6480" w:hanging="360"/>
+      </w:pPr>
+      <w:rPr>
+        <w:rFonts w:ascii="Wingdings" w:hAnsi="Wingdings" w:hint="default"/>
+        <w:sz w:val="20"/>
+      </w:rPr>
+    </w:lvl>
+  </w:abstractNum>
+  <w:abstractNum w:abstractNumId="13" w15:restartNumberingAfterBreak="0">
     <w:nsid w:val="607070A1"/>
     <w:multiLevelType w:val="multilevel"/>
     <w:tmpl w:val="3AC02946"/>
@@ -11989,7 +12900,7 @@
       </w:pPr>
     </w:lvl>
   </w:abstractNum>
-  <w:abstractNum w:abstractNumId="10" w15:restartNumberingAfterBreak="0">
+  <w:abstractNum w:abstractNumId="14" w15:restartNumberingAfterBreak="0">
     <w:nsid w:val="61CF0CAF"/>
     <w:multiLevelType w:val="multilevel"/>
     <w:tmpl w:val="8AD246A6"/>
@@ -12102,7 +13013,7 @@
       </w:pPr>
     </w:lvl>
   </w:abstractNum>
-  <w:abstractNum w:abstractNumId="11" w15:restartNumberingAfterBreak="0">
+  <w:abstractNum w:abstractNumId="15" w15:restartNumberingAfterBreak="0">
     <w:nsid w:val="65955DC9"/>
     <w:multiLevelType w:val="multilevel"/>
     <w:tmpl w:val="64FC81FA"/>
@@ -12251,7 +13162,7 @@
       </w:rPr>
     </w:lvl>
   </w:abstractNum>
-  <w:abstractNum w:abstractNumId="12" w15:restartNumberingAfterBreak="0">
+  <w:abstractNum w:abstractNumId="16" w15:restartNumberingAfterBreak="0">
     <w:nsid w:val="66ED6C04"/>
     <w:multiLevelType w:val="multilevel"/>
     <w:tmpl w:val="325C4576"/>
@@ -12368,44 +13279,360 @@
       </w:pPr>
     </w:lvl>
   </w:abstractNum>
+  <w:abstractNum w:abstractNumId="17" w15:restartNumberingAfterBreak="0">
+    <w:nsid w:val="6B195E0F"/>
+    <w:multiLevelType w:val="multilevel"/>
+    <w:tmpl w:val="85EE6E18"/>
+    <w:lvl w:ilvl="0">
+      <w:start w:val="1"/>
+      <w:numFmt w:val="bullet"/>
+      <w:lvlText w:val=""/>
+      <w:lvlJc w:val="left"/>
+      <w:pPr>
+        <w:tabs>
+          <w:tab w:val="num" w:pos="720"/>
+        </w:tabs>
+        <w:ind w:left="720" w:hanging="360"/>
+      </w:pPr>
+      <w:rPr>
+        <w:rFonts w:ascii="Symbol" w:hAnsi="Symbol" w:hint="default"/>
+        <w:sz w:val="20"/>
+      </w:rPr>
+    </w:lvl>
+    <w:lvl w:ilvl="1" w:tentative="1">
+      <w:start w:val="1"/>
+      <w:numFmt w:val="bullet"/>
+      <w:lvlText w:val="o"/>
+      <w:lvlJc w:val="left"/>
+      <w:pPr>
+        <w:tabs>
+          <w:tab w:val="num" w:pos="1440"/>
+        </w:tabs>
+        <w:ind w:left="1440" w:hanging="360"/>
+      </w:pPr>
+      <w:rPr>
+        <w:rFonts w:ascii="Courier New" w:hAnsi="Courier New" w:hint="default"/>
+        <w:sz w:val="20"/>
+      </w:rPr>
+    </w:lvl>
+    <w:lvl w:ilvl="2" w:tentative="1">
+      <w:start w:val="1"/>
+      <w:numFmt w:val="bullet"/>
+      <w:lvlText w:val=""/>
+      <w:lvlJc w:val="left"/>
+      <w:pPr>
+        <w:tabs>
+          <w:tab w:val="num" w:pos="2160"/>
+        </w:tabs>
+        <w:ind w:left="2160" w:hanging="360"/>
+      </w:pPr>
+      <w:rPr>
+        <w:rFonts w:ascii="Wingdings" w:hAnsi="Wingdings" w:hint="default"/>
+        <w:sz w:val="20"/>
+      </w:rPr>
+    </w:lvl>
+    <w:lvl w:ilvl="3" w:tentative="1">
+      <w:start w:val="1"/>
+      <w:numFmt w:val="bullet"/>
+      <w:lvlText w:val=""/>
+      <w:lvlJc w:val="left"/>
+      <w:pPr>
+        <w:tabs>
+          <w:tab w:val="num" w:pos="2880"/>
+        </w:tabs>
+        <w:ind w:left="2880" w:hanging="360"/>
+      </w:pPr>
+      <w:rPr>
+        <w:rFonts w:ascii="Wingdings" w:hAnsi="Wingdings" w:hint="default"/>
+        <w:sz w:val="20"/>
+      </w:rPr>
+    </w:lvl>
+    <w:lvl w:ilvl="4" w:tentative="1">
+      <w:start w:val="1"/>
+      <w:numFmt w:val="bullet"/>
+      <w:lvlText w:val=""/>
+      <w:lvlJc w:val="left"/>
+      <w:pPr>
+        <w:tabs>
+          <w:tab w:val="num" w:pos="3600"/>
+        </w:tabs>
+        <w:ind w:left="3600" w:hanging="360"/>
+      </w:pPr>
+      <w:rPr>
+        <w:rFonts w:ascii="Wingdings" w:hAnsi="Wingdings" w:hint="default"/>
+        <w:sz w:val="20"/>
+      </w:rPr>
+    </w:lvl>
+    <w:lvl w:ilvl="5" w:tentative="1">
+      <w:start w:val="1"/>
+      <w:numFmt w:val="bullet"/>
+      <w:lvlText w:val=""/>
+      <w:lvlJc w:val="left"/>
+      <w:pPr>
+        <w:tabs>
+          <w:tab w:val="num" w:pos="4320"/>
+        </w:tabs>
+        <w:ind w:left="4320" w:hanging="360"/>
+      </w:pPr>
+      <w:rPr>
+        <w:rFonts w:ascii="Wingdings" w:hAnsi="Wingdings" w:hint="default"/>
+        <w:sz w:val="20"/>
+      </w:rPr>
+    </w:lvl>
+    <w:lvl w:ilvl="6" w:tentative="1">
+      <w:start w:val="1"/>
+      <w:numFmt w:val="bullet"/>
+      <w:lvlText w:val=""/>
+      <w:lvlJc w:val="left"/>
+      <w:pPr>
+        <w:tabs>
+          <w:tab w:val="num" w:pos="5040"/>
+        </w:tabs>
+        <w:ind w:left="5040" w:hanging="360"/>
+      </w:pPr>
+      <w:rPr>
+        <w:rFonts w:ascii="Wingdings" w:hAnsi="Wingdings" w:hint="default"/>
+        <w:sz w:val="20"/>
+      </w:rPr>
+    </w:lvl>
+    <w:lvl w:ilvl="7" w:tentative="1">
+      <w:start w:val="1"/>
+      <w:numFmt w:val="bullet"/>
+      <w:lvlText w:val=""/>
+      <w:lvlJc w:val="left"/>
+      <w:pPr>
+        <w:tabs>
+          <w:tab w:val="num" w:pos="5760"/>
+        </w:tabs>
+        <w:ind w:left="5760" w:hanging="360"/>
+      </w:pPr>
+      <w:rPr>
+        <w:rFonts w:ascii="Wingdings" w:hAnsi="Wingdings" w:hint="default"/>
+        <w:sz w:val="20"/>
+      </w:rPr>
+    </w:lvl>
+    <w:lvl w:ilvl="8" w:tentative="1">
+      <w:start w:val="1"/>
+      <w:numFmt w:val="bullet"/>
+      <w:lvlText w:val=""/>
+      <w:lvlJc w:val="left"/>
+      <w:pPr>
+        <w:tabs>
+          <w:tab w:val="num" w:pos="6480"/>
+        </w:tabs>
+        <w:ind w:left="6480" w:hanging="360"/>
+      </w:pPr>
+      <w:rPr>
+        <w:rFonts w:ascii="Wingdings" w:hAnsi="Wingdings" w:hint="default"/>
+        <w:sz w:val="20"/>
+      </w:rPr>
+    </w:lvl>
+  </w:abstractNum>
+  <w:abstractNum w:abstractNumId="18" w15:restartNumberingAfterBreak="0">
+    <w:nsid w:val="6BAF551D"/>
+    <w:multiLevelType w:val="multilevel"/>
+    <w:tmpl w:val="1DC220CC"/>
+    <w:lvl w:ilvl="0">
+      <w:start w:val="1"/>
+      <w:numFmt w:val="bullet"/>
+      <w:lvlText w:val=""/>
+      <w:lvlJc w:val="left"/>
+      <w:pPr>
+        <w:tabs>
+          <w:tab w:val="num" w:pos="720"/>
+        </w:tabs>
+        <w:ind w:left="720" w:hanging="360"/>
+      </w:pPr>
+      <w:rPr>
+        <w:rFonts w:ascii="Symbol" w:hAnsi="Symbol" w:hint="default"/>
+        <w:sz w:val="20"/>
+      </w:rPr>
+    </w:lvl>
+    <w:lvl w:ilvl="1" w:tentative="1">
+      <w:start w:val="1"/>
+      <w:numFmt w:val="bullet"/>
+      <w:lvlText w:val="o"/>
+      <w:lvlJc w:val="left"/>
+      <w:pPr>
+        <w:tabs>
+          <w:tab w:val="num" w:pos="1440"/>
+        </w:tabs>
+        <w:ind w:left="1440" w:hanging="360"/>
+      </w:pPr>
+      <w:rPr>
+        <w:rFonts w:ascii="Courier New" w:hAnsi="Courier New" w:hint="default"/>
+        <w:sz w:val="20"/>
+      </w:rPr>
+    </w:lvl>
+    <w:lvl w:ilvl="2" w:tentative="1">
+      <w:start w:val="1"/>
+      <w:numFmt w:val="bullet"/>
+      <w:lvlText w:val=""/>
+      <w:lvlJc w:val="left"/>
+      <w:pPr>
+        <w:tabs>
+          <w:tab w:val="num" w:pos="2160"/>
+        </w:tabs>
+        <w:ind w:left="2160" w:hanging="360"/>
+      </w:pPr>
+      <w:rPr>
+        <w:rFonts w:ascii="Wingdings" w:hAnsi="Wingdings" w:hint="default"/>
+        <w:sz w:val="20"/>
+      </w:rPr>
+    </w:lvl>
+    <w:lvl w:ilvl="3" w:tentative="1">
+      <w:start w:val="1"/>
+      <w:numFmt w:val="bullet"/>
+      <w:lvlText w:val=""/>
+      <w:lvlJc w:val="left"/>
+      <w:pPr>
+        <w:tabs>
+          <w:tab w:val="num" w:pos="2880"/>
+        </w:tabs>
+        <w:ind w:left="2880" w:hanging="360"/>
+      </w:pPr>
+      <w:rPr>
+        <w:rFonts w:ascii="Wingdings" w:hAnsi="Wingdings" w:hint="default"/>
+        <w:sz w:val="20"/>
+      </w:rPr>
+    </w:lvl>
+    <w:lvl w:ilvl="4" w:tentative="1">
+      <w:start w:val="1"/>
+      <w:numFmt w:val="bullet"/>
+      <w:lvlText w:val=""/>
+      <w:lvlJc w:val="left"/>
+      <w:pPr>
+        <w:tabs>
+          <w:tab w:val="num" w:pos="3600"/>
+        </w:tabs>
+        <w:ind w:left="3600" w:hanging="360"/>
+      </w:pPr>
+      <w:rPr>
+        <w:rFonts w:ascii="Wingdings" w:hAnsi="Wingdings" w:hint="default"/>
+        <w:sz w:val="20"/>
+      </w:rPr>
+    </w:lvl>
+    <w:lvl w:ilvl="5" w:tentative="1">
+      <w:start w:val="1"/>
+      <w:numFmt w:val="bullet"/>
+      <w:lvlText w:val=""/>
+      <w:lvlJc w:val="left"/>
+      <w:pPr>
+        <w:tabs>
+          <w:tab w:val="num" w:pos="4320"/>
+        </w:tabs>
+        <w:ind w:left="4320" w:hanging="360"/>
+      </w:pPr>
+      <w:rPr>
+        <w:rFonts w:ascii="Wingdings" w:hAnsi="Wingdings" w:hint="default"/>
+        <w:sz w:val="20"/>
+      </w:rPr>
+    </w:lvl>
+    <w:lvl w:ilvl="6" w:tentative="1">
+      <w:start w:val="1"/>
+      <w:numFmt w:val="bullet"/>
+      <w:lvlText w:val=""/>
+      <w:lvlJc w:val="left"/>
+      <w:pPr>
+        <w:tabs>
+          <w:tab w:val="num" w:pos="5040"/>
+        </w:tabs>
+        <w:ind w:left="5040" w:hanging="360"/>
+      </w:pPr>
+      <w:rPr>
+        <w:rFonts w:ascii="Wingdings" w:hAnsi="Wingdings" w:hint="default"/>
+        <w:sz w:val="20"/>
+      </w:rPr>
+    </w:lvl>
+    <w:lvl w:ilvl="7" w:tentative="1">
+      <w:start w:val="1"/>
+      <w:numFmt w:val="bullet"/>
+      <w:lvlText w:val=""/>
+      <w:lvlJc w:val="left"/>
+      <w:pPr>
+        <w:tabs>
+          <w:tab w:val="num" w:pos="5760"/>
+        </w:tabs>
+        <w:ind w:left="5760" w:hanging="360"/>
+      </w:pPr>
+      <w:rPr>
+        <w:rFonts w:ascii="Wingdings" w:hAnsi="Wingdings" w:hint="default"/>
+        <w:sz w:val="20"/>
+      </w:rPr>
+    </w:lvl>
+    <w:lvl w:ilvl="8" w:tentative="1">
+      <w:start w:val="1"/>
+      <w:numFmt w:val="bullet"/>
+      <w:lvlText w:val=""/>
+      <w:lvlJc w:val="left"/>
+      <w:pPr>
+        <w:tabs>
+          <w:tab w:val="num" w:pos="6480"/>
+        </w:tabs>
+        <w:ind w:left="6480" w:hanging="360"/>
+      </w:pPr>
+      <w:rPr>
+        <w:rFonts w:ascii="Wingdings" w:hAnsi="Wingdings" w:hint="default"/>
+        <w:sz w:val="20"/>
+      </w:rPr>
+    </w:lvl>
+  </w:abstractNum>
   <w:num w:numId="1" w16cid:durableId="817500428">
-    <w:abstractNumId w:val="7"/>
+    <w:abstractNumId w:val="9"/>
   </w:num>
   <w:num w:numId="2" w16cid:durableId="188959275">
-    <w:abstractNumId w:val="2"/>
+    <w:abstractNumId w:val="3"/>
   </w:num>
   <w:num w:numId="3" w16cid:durableId="550267766">
     <w:abstractNumId w:val="0"/>
   </w:num>
   <w:num w:numId="4" w16cid:durableId="1921716003">
-    <w:abstractNumId w:val="9"/>
+    <w:abstractNumId w:val="13"/>
   </w:num>
   <w:num w:numId="5" w16cid:durableId="1549223719">
+    <w:abstractNumId w:val="14"/>
+  </w:num>
+  <w:num w:numId="6" w16cid:durableId="1705592760">
+    <w:abstractNumId w:val="15"/>
+  </w:num>
+  <w:num w:numId="7" w16cid:durableId="282737521">
+    <w:abstractNumId w:val="16"/>
+  </w:num>
+  <w:num w:numId="8" w16cid:durableId="241566754">
+    <w:abstractNumId w:val="2"/>
+  </w:num>
+  <w:num w:numId="9" w16cid:durableId="1949658636">
+    <w:abstractNumId w:val="5"/>
+  </w:num>
+  <w:num w:numId="10" w16cid:durableId="54858427">
+    <w:abstractNumId w:val="11"/>
+  </w:num>
+  <w:num w:numId="11" w16cid:durableId="498693789">
+    <w:abstractNumId w:val="6"/>
+  </w:num>
+  <w:num w:numId="12" w16cid:durableId="64257673">
+    <w:abstractNumId w:val="7"/>
+  </w:num>
+  <w:num w:numId="13" w16cid:durableId="836461605">
+    <w:abstractNumId w:val="4"/>
+  </w:num>
+  <w:num w:numId="14" w16cid:durableId="1068958318">
+    <w:abstractNumId w:val="18"/>
+  </w:num>
+  <w:num w:numId="15" w16cid:durableId="1118403965">
     <w:abstractNumId w:val="10"/>
   </w:num>
-  <w:num w:numId="6" w16cid:durableId="1705592760">
-    <w:abstractNumId w:val="11"/>
+  <w:num w:numId="16" w16cid:durableId="109083514">
+    <w:abstractNumId w:val="17"/>
   </w:num>
-  <w:num w:numId="7" w16cid:durableId="282737521">
-    <w:abstractNumId w:val="12"/>
+  <w:num w:numId="17" w16cid:durableId="28458425">
+    <w:abstractNumId w:val="8"/>
   </w:num>
-  <w:num w:numId="8" w16cid:durableId="241566754">
+  <w:num w:numId="18" w16cid:durableId="417554790">
     <w:abstractNumId w:val="1"/>
   </w:num>
-  <w:num w:numId="9" w16cid:durableId="1949658636">
-    <w:abstractNumId w:val="4"/>
-  </w:num>
-  <w:num w:numId="10" w16cid:durableId="54858427">
-    <w:abstractNumId w:val="8"/>
-  </w:num>
-  <w:num w:numId="11" w16cid:durableId="498693789">
-    <w:abstractNumId w:val="5"/>
-  </w:num>
-  <w:num w:numId="12" w16cid:durableId="64257673">
-    <w:abstractNumId w:val="6"/>
-  </w:num>
-  <w:num w:numId="13" w16cid:durableId="836461605">
-    <w:abstractNumId w:val="3"/>
+  <w:num w:numId="19" w16cid:durableId="1322393742">
+    <w:abstractNumId w:val="12"/>
   </w:num>
 </w:numbering>
 </file>
@@ -13013,7 +14240,6 @@
   <w:style w:type="character" w:default="1" w:styleId="DefaultParagraphFont">
     <w:name w:val="Default Paragraph Font"/>
     <w:uiPriority w:val="1"/>
-    <w:semiHidden/>
     <w:unhideWhenUsed/>
   </w:style>
   <w:style w:type="table" w:default="1" w:styleId="TableNormal">

</xml_diff>